<commit_message>
FET group control, GUI 2x4 layout, RC defaults, updated documentation
</commit_message>
<xml_diff>
--- a/JET ECU Firmware/JET_ECU_Project_Documentation.docx
+++ b/JET ECU Firmware/JET_ECU_Project_Documentation.docx
@@ -239,7 +239,7 @@
               <w:rPr>
                 <w:sz w:val="20"/>
               </w:rPr>
-              <w:t>Monitor battery / supply voltage up to 24 V with ±0.1 V accuracy.</w:t>
+              <w:t>Monitor battery / supply voltage up to 26 V with ±0.1 V accuracy.</w:t>
             </w:r>
           </w:p>
         </w:tc>
@@ -303,7 +303,7 @@
               <w:rPr>
                 <w:sz w:val="20"/>
               </w:rPr>
-              <w:t>Control six high-side FET outputs independently from the GUI.</w:t>
+              <w:t>Control six high-side FET outputs individually or all at once (ALL HIGH / ALL LOW) from the GUI.</w:t>
             </w:r>
           </w:p>
         </w:tc>
@@ -399,7 +399,7 @@
               <w:rPr>
                 <w:sz w:val="20"/>
               </w:rPr>
-              <w:t>Accept FET toggle commands and RC calibration commands from the GUI.</w:t>
+              <w:t>Accept individual FET toggle commands, group FET commands, and RC calibration commands from the GUI.</w:t>
             </w:r>
           </w:p>
         </w:tc>
@@ -432,6 +432,38 @@
                 <w:sz w:val="20"/>
               </w:rPr>
               <w:t>Provide a PC-side dashboard with live gauges — no internet required.</w:t>
+            </w:r>
+          </w:p>
+        </w:tc>
+      </w:tr>
+      <w:tr>
+        <w:tc>
+          <w:tcPr>
+            <w:tcW w:type="dxa" w:w="1417"/>
+            <w:shd w:val="clear" w:color="auto" w:fill="F2F2F2"/>
+            <w:vAlign w:val="center"/>
+          </w:tcPr>
+          <w:p>
+            <w:r>
+              <w:rPr>
+                <w:sz w:val="20"/>
+              </w:rPr>
+              <w:t>FR-09</w:t>
+            </w:r>
+          </w:p>
+        </w:tc>
+        <w:tc>
+          <w:tcPr>
+            <w:tcW w:type="dxa" w:w="7370"/>
+            <w:shd w:val="clear" w:color="auto" w:fill="F2F2F2"/>
+            <w:vAlign w:val="center"/>
+          </w:tcPr>
+          <w:p>
+            <w:r>
+              <w:rPr>
+                <w:sz w:val="20"/>
+              </w:rPr>
+              <w:t>RC throttle must work immediately on power-on using hardcoded default calibration values.</w:t>
             </w:r>
           </w:p>
         </w:tc>
@@ -1045,7 +1077,7 @@
               <w:rPr>
                 <w:sz w:val="20"/>
               </w:rPr>
-              <w:t>R12DS CH3 signal — digital GPIO input, 1000–2000 µs PWM</w:t>
+              <w:t>R12DS CH3 signal — digital GPIO_Input NOPULL, pulseIn via DWT cycle counter</w:t>
             </w:r>
           </w:p>
         </w:tc>
@@ -1186,7 +1218,7 @@
               <w:rPr>
                 <w:sz w:val="20"/>
               </w:rPr>
-              <w:t>Serial input from PC (115200 baud, DMA with IDLE detection)</w:t>
+              <w:t>Serial input from PC (115200 baud, DMA Normal mode + IDLE detection)</w:t>
             </w:r>
           </w:p>
         </w:tc>
@@ -1233,7 +1265,7 @@
               <w:rPr>
                 <w:sz w:val="20"/>
               </w:rPr>
-              <w:t>MAX31855 #1 clock (EGT / Exhaust)</w:t>
+              <w:t>MAX31855 #1 clock (EGT / Exhaust), SPI1</w:t>
             </w:r>
           </w:p>
         </w:tc>
@@ -1280,7 +1312,7 @@
               <w:rPr>
                 <w:sz w:val="20"/>
               </w:rPr>
-              <w:t>MAX31855 #1 data out</w:t>
+              <w:t>MAX31855 #1 data out, SPI1</w:t>
             </w:r>
           </w:p>
         </w:tc>
@@ -1374,7 +1406,7 @@
               <w:rPr>
                 <w:sz w:val="20"/>
               </w:rPr>
-              <w:t>MAX31855 #2 clock (Intake / Ambient)</w:t>
+              <w:t>MAX31855 #2 clock (Intake / Ambient), SPI2</w:t>
             </w:r>
           </w:p>
         </w:tc>
@@ -1421,7 +1453,7 @@
               <w:rPr>
                 <w:sz w:val="20"/>
               </w:rPr>
-              <w:t>MAX31855 #2 data out</w:t>
+              <w:t>MAX31855 #2 data out, SPI2</w:t>
             </w:r>
           </w:p>
         </w:tc>
@@ -2045,7 +2077,7 @@
               <w:rPr>
                 <w:sz w:val="20"/>
               </w:rPr>
-              <w:t>Reads RC PWM via GPIO polling (pulseIn), applies spike filter, maps to 0–100 % throttle, sends THR: output.</w:t>
+              <w:t>Reads RC PWM via GPIO polling (pulseIn_us), applies spike filter and hold-last-valid logic, maps to 0–100 % throttle, sends THR: output.</w:t>
             </w:r>
           </w:p>
         </w:tc>
@@ -2107,7 +2139,7 @@
               <w:rPr>
                 <w:sz w:val="20"/>
               </w:rPr>
-              <w:t>Averages 64 ADC DMA samples (1 ms apart) for battery voltage, applies two-point raw-count calibration, reads MCU die temp every 1000 ms.</w:t>
+              <w:t>Averages 64 ADC DMA samples (1 ms apart) for battery voltage, applies two-point raw-count calibration. Reads MCU die temp every 1000 ms.</w:t>
             </w:r>
           </w:p>
         </w:tc>
@@ -2169,7 +2201,7 @@
               <w:rPr>
                 <w:sz w:val="20"/>
               </w:rPr>
-              <w:t>Reads current state of all 6 FET pins and reports FET:x,x,x,x,x,x over serial.</w:t>
+              <w:t>Reads current GPIO state of all 6 FET pins and reports FET:x,x,x,x,x,x over serial.</w:t>
             </w:r>
           </w:p>
         </w:tc>
@@ -2231,7 +2263,7 @@
               <w:rPr>
                 <w:sz w:val="20"/>
               </w:rPr>
-              <w:t>Waits on UART IDLE semaphore, parses incoming commands (FETn:x, CAL_CENTER, CAL_FULL, CAL_RESET), executes and responds.</w:t>
+              <w:t>Waits on UART IDLE semaphore, parses incoming commands (FETn:x, FET_ALL:x, CAL_CENTER, CAL_FULL, CAL_RESET), executes and responds.</w:t>
             </w:r>
           </w:p>
         </w:tc>
@@ -2540,7 +2572,7 @@
               <w:rPr>
                 <w:sz w:val="20"/>
               </w:rPr>
-              <w:t>DMA_NORMAL + IDLE detection</w:t>
+              <w:t>DMA Normal + IDLE detection</w:t>
             </w:r>
           </w:p>
         </w:tc>
@@ -2555,7 +2587,7 @@
               <w:rPr>
                 <w:sz w:val="20"/>
               </w:rPr>
-              <w:t>HAL_UARTEx_ReceiveToIdle_DMA, semaphore on each line received</w:t>
+              <w:t>HAL_UARTEx_ReceiveToIdle_DMA; half-transfer interrupt disabled; semaphore on each line received</w:t>
             </w:r>
           </w:p>
         </w:tc>
@@ -2649,7 +2681,7 @@
               <w:rPr>
                 <w:sz w:val="20"/>
               </w:rPr>
-              <w:t>Measures pulse width without using a hardware timer</w:t>
+              <w:t>Measures pulse width without a hardware timer; 50 ms timeout per call</w:t>
             </w:r>
           </w:p>
         </w:tc>
@@ -2695,7 +2727,7 @@
         <w:rPr>
           <w:sz w:val="22"/>
         </w:rPr>
-        <w:t>Voltage divider: 39 kΩ (R1) + 5.6 kΩ (R2) scales battery voltage to ADC input range.</w:t>
+        <w:t>Voltage divider: 39 kΩ (R1) + 5.6 kΩ (R2) scales battery voltage to ADC input range (max ~26 V).</w:t>
       </w:r>
     </w:p>
     <w:p>
@@ -2708,7 +2740,7 @@
         <w:rPr>
           <w:sz w:val="22"/>
         </w:rPr>
-        <w:t>ADC1 CH1 (PA1) reads in 12-bit DMA circular mode alongside MCU temperature.</w:t>
+        <w:t>ADC1 CH1 (PA1) reads in 12-bit DMA circular mode alongside MCU temperature on CH16.</w:t>
       </w:r>
     </w:p>
     <w:p>
@@ -2747,7 +2779,7 @@
         <w:rPr>
           <w:sz w:val="22"/>
         </w:rPr>
-        <w:t>VBATT_RAW_ZERO = 190  →  any raw count ≤ 190 reports 0.00 V (eliminates ~0.15 V noise floor)</w:t>
+        <w:t>VBATT_RAW_ZERO = 190  →  raw count ≤ 190 reports 0.00 V (eliminates ~0.15 V noise floor)</w:t>
       </w:r>
     </w:p>
     <w:p>
@@ -2760,7 +2792,7 @@
         <w:rPr>
           <w:sz w:val="22"/>
         </w:rPr>
-        <w:t>VBATT_RAW_CAL  = 3923 at VBATT_MV_CAL = 24000 mV  →  sets the full-scale calibration point</w:t>
+        <w:t>VBATT_RAW_CAL  = 3923 at VBATT_MV_CAL = 24000 mV  →  full-scale calibration point</w:t>
       </w:r>
     </w:p>
     <w:p>
@@ -2799,7 +2831,7 @@
         <w:rPr>
           <w:sz w:val="22"/>
         </w:rPr>
-        <w:t>Calibration constants are defined in one place (#define block) — easy to update per board.</w:t>
+        <w:t>Calibration constants in one #define block in firmware — easy to update per board.</w:t>
       </w:r>
     </w:p>
     <w:p>
@@ -2825,7 +2857,7 @@
         <w:rPr>
           <w:sz w:val="22"/>
         </w:rPr>
-        <w:t>RC receiver R12DS CH3 output connected to PA0 configured as digital GPIO input (no pull resistor).</w:t>
+        <w:t>RC receiver R12DS CH3 output connected to PA0 as digital GPIO_Input (no pull resistor).</w:t>
       </w:r>
     </w:p>
     <w:p>
@@ -2838,7 +2870,7 @@
         <w:rPr>
           <w:sz w:val="22"/>
         </w:rPr>
-        <w:t>Standard RC PWM: 1000–2000 µs pulse at 50 Hz encodes throttle position.</w:t>
+        <w:t>PA0 must NOT be configured as ADC input — RC PWM is a 3.3–5 V square wave, not an analog signal.</w:t>
       </w:r>
     </w:p>
     <w:p>
@@ -2851,7 +2883,7 @@
         <w:rPr>
           <w:sz w:val="22"/>
         </w:rPr>
-        <w:t>pulseIn_us() function uses the DWT cycle counter to time the HIGH pulse with 1 µs resolution.</w:t>
+        <w:t>pulseIn_us() function uses the DWT cycle counter (64 cycles = 1 µs) to time the HIGH pulse.</w:t>
       </w:r>
     </w:p>
     <w:p>
@@ -2890,7 +2922,7 @@
         <w:rPr>
           <w:sz w:val="22"/>
         </w:rPr>
-        <w:t>Hold-last-valid: throttle holds the last good reading; resets to center only after 500 ms signal loss.</w:t>
+        <w:t>Hold-last-valid: maintains last good value; resets to center only after 500 ms of signal loss.</w:t>
       </w:r>
     </w:p>
     <w:p>
@@ -2903,7 +2935,7 @@
         <w:rPr>
           <w:sz w:val="22"/>
         </w:rPr>
-        <w:t>GUI-driven two-point calibration:</w:t>
+        <w:t>Default calibration values (stored in firmware, active from first power-on):</w:t>
       </w:r>
     </w:p>
     <w:p>
@@ -2916,7 +2948,7 @@
         <w:rPr>
           <w:sz w:val="22"/>
         </w:rPr>
-        <w:t>CAL_CENTER → firmware averages 10 pulses at center position → sets 0 % reference</w:t>
+        <w:t>rc_pw_min = 1540 µs  →  0 % throttle reference (measured neutral position on this board)</w:t>
       </w:r>
     </w:p>
     <w:p>
@@ -2929,7 +2961,7 @@
         <w:rPr>
           <w:sz w:val="22"/>
         </w:rPr>
-        <w:t>CAL_FULL   → firmware averages 10 pulses at full throttle  → sets 100 % reference</w:t>
+        <w:t>rc_pw_max = 2000 µs  →  100 % throttle reference (full throw)</w:t>
       </w:r>
     </w:p>
     <w:p>
@@ -2942,7 +2974,7 @@
         <w:rPr>
           <w:sz w:val="22"/>
         </w:rPr>
-        <w:t>CAL_RESET  → clears calibration; throttle returns 0 % until recalibrated</w:t>
+        <w:t>Throttle works immediately on power-on without requiring user calibration.</w:t>
       </w:r>
     </w:p>
     <w:p>
@@ -2955,7 +2987,72 @@
         <w:rPr>
           <w:sz w:val="22"/>
         </w:rPr>
-        <w:t>Values outside calibrated range are clamped (below center = 0 %, above full = 100 %).</w:t>
+        <w:t>GUI-driven recalibration (optional — use if defaults do not match your transmitter):</w:t>
+      </w:r>
+    </w:p>
+    <w:p>
+      <w:pPr>
+        <w:pStyle w:val="ListBullet"/>
+        <w:spacing w:before="20" w:after="20"/>
+        <w:ind w:left="720"/>
+      </w:pPr>
+      <w:r>
+        <w:rPr>
+          <w:sz w:val="22"/>
+        </w:rPr>
+        <w:t>CAL_CENTER → averages 10 pulses at center position → overwrites 0 % reference in RAM</w:t>
+      </w:r>
+    </w:p>
+    <w:p>
+      <w:pPr>
+        <w:pStyle w:val="ListBullet"/>
+        <w:spacing w:before="20" w:after="20"/>
+        <w:ind w:left="720"/>
+      </w:pPr>
+      <w:r>
+        <w:rPr>
+          <w:sz w:val="22"/>
+        </w:rPr>
+        <w:t>CAL_FULL   → averages 10 pulses at full throw → overwrites 100 % reference in RAM</w:t>
+      </w:r>
+    </w:p>
+    <w:p>
+      <w:pPr>
+        <w:pStyle w:val="ListBullet"/>
+        <w:spacing w:before="20" w:after="20"/>
+        <w:ind w:left="720"/>
+      </w:pPr>
+      <w:r>
+        <w:rPr>
+          <w:sz w:val="22"/>
+        </w:rPr>
+        <w:t>CAL_RESET  → clears RAM calibration to 0/0; throttle reads 0 % until SET RC is run again</w:t>
+      </w:r>
+    </w:p>
+    <w:p>
+      <w:pPr>
+        <w:pStyle w:val="ListBullet"/>
+        <w:spacing w:before="20" w:after="20"/>
+        <w:ind w:left="360"/>
+      </w:pPr>
+      <w:r>
+        <w:rPr>
+          <w:sz w:val="22"/>
+        </w:rPr>
+        <w:t>Values outside calibrated range are clamped (below min = 0 %, above max = 100 %).</w:t>
+      </w:r>
+    </w:p>
+    <w:p>
+      <w:pPr>
+        <w:pStyle w:val="ListBullet"/>
+        <w:spacing w:before="20" w:after="20"/>
+        <w:ind w:left="360"/>
+      </w:pPr>
+      <w:r>
+        <w:rPr>
+          <w:sz w:val="22"/>
+        </w:rPr>
+        <w:t>RAM calibration is lost on power cycle — defaults (1540/2000) are restored automatically.</w:t>
       </w:r>
     </w:p>
     <w:p>
@@ -2994,7 +3091,7 @@
         <w:rPr>
           <w:sz w:val="22"/>
         </w:rPr>
-        <w:t>Six FET control pins on GPIOB, all initialised LOW (safe off state) at startup.</w:t>
+        <w:t>Six FET control pins on GPIOB (FET1=PB6, FET2=PB5, FET3=PB9, FET4=PB8, FET5=PB4, FET6=PB7).</w:t>
       </w:r>
     </w:p>
     <w:p>
@@ -3007,7 +3104,46 @@
         <w:rPr>
           <w:sz w:val="22"/>
         </w:rPr>
-        <w:t>GUI sends FETn:1 or FETn:0 (n = 1–6) to toggle individual FETs.</w:t>
+        <w:t>All pins initialised LOW (safe off state) at startup.</w:t>
+      </w:r>
+    </w:p>
+    <w:p>
+      <w:pPr>
+        <w:pStyle w:val="ListBullet"/>
+        <w:spacing w:before="20" w:after="20"/>
+        <w:ind w:left="360"/>
+      </w:pPr>
+      <w:r>
+        <w:rPr>
+          <w:sz w:val="22"/>
+        </w:rPr>
+        <w:t>Individual control: GUI sends FETn:1 or FETn:0 (n = 1–6) to toggle any single FET.</w:t>
+      </w:r>
+    </w:p>
+    <w:p>
+      <w:pPr>
+        <w:pStyle w:val="ListBullet"/>
+        <w:spacing w:before="20" w:after="20"/>
+        <w:ind w:left="360"/>
+      </w:pPr>
+      <w:r>
+        <w:rPr>
+          <w:sz w:val="22"/>
+        </w:rPr>
+        <w:t>Group control: GUI sends FET_ALL:1 (all 6 FETs HIGH) or FET_ALL:0 (all 6 FETs LOW).</w:t>
+      </w:r>
+    </w:p>
+    <w:p>
+      <w:pPr>
+        <w:pStyle w:val="ListBullet"/>
+        <w:spacing w:before="20" w:after="20"/>
+        <w:ind w:left="360"/>
+      </w:pPr>
+      <w:r>
+        <w:rPr>
+          <w:sz w:val="22"/>
+        </w:rPr>
+        <w:t>Firmware confirms group commands: responds FET_ALL:1 or FET_ALL:0 over UART.</w:t>
       </w:r>
     </w:p>
     <w:p>
@@ -3033,7 +3169,59 @@
         <w:rPr>
           <w:sz w:val="22"/>
         </w:rPr>
-        <w:t>GUI displays live status LEDs and toggle buttons in a 2×3 grid layout.</w:t>
+        <w:t>GUI FET panel layout — 2 rows × 4 columns:</w:t>
+      </w:r>
+    </w:p>
+    <w:p>
+      <w:pPr>
+        <w:pStyle w:val="ListBullet"/>
+        <w:spacing w:before="20" w:after="20"/>
+        <w:ind w:left="720"/>
+      </w:pPr>
+      <w:r>
+        <w:rPr>
+          <w:sz w:val="22"/>
+        </w:rPr>
+        <w:t>Row 0:  FET 1  |  FET 3  |  FET 5  |  ALL HIGH (green LED, sets all 6 HIGH)</w:t>
+      </w:r>
+    </w:p>
+    <w:p>
+      <w:pPr>
+        <w:pStyle w:val="ListBullet"/>
+        <w:spacing w:before="20" w:after="20"/>
+        <w:ind w:left="720"/>
+      </w:pPr>
+      <w:r>
+        <w:rPr>
+          <w:sz w:val="22"/>
+        </w:rPr>
+        <w:t>Row 1:  FET 2  |  FET 4  |  FET 6  |  ALL LOW  (red LED,   sets all 6 LOW)</w:t>
+      </w:r>
+    </w:p>
+    <w:p>
+      <w:pPr>
+        <w:pStyle w:val="ListBullet"/>
+        <w:spacing w:before="20" w:after="20"/>
+        <w:ind w:left="360"/>
+      </w:pPr>
+      <w:r>
+        <w:rPr>
+          <w:sz w:val="22"/>
+        </w:rPr>
+        <w:t>Each cell shows: coloured LED (green=ON, red=OFF), label, state text, and action button.</w:t>
+      </w:r>
+    </w:p>
+    <w:p>
+      <w:pPr>
+        <w:pStyle w:val="ListBullet"/>
+        <w:spacing w:before="20" w:after="20"/>
+        <w:ind w:left="360"/>
+      </w:pPr>
+      <w:r>
+        <w:rPr>
+          <w:sz w:val="22"/>
+        </w:rPr>
+        <w:t>ALL HIGH / ALL LOW buttons update all six GUI LEDs immediately on click.</w:t>
       </w:r>
     </w:p>
     <w:p>
@@ -3072,7 +3260,7 @@
         <w:rPr>
           <w:sz w:val="22"/>
         </w:rPr>
-        <w:t>TC1 on PA5/PA6/PB0 monitors exhaust gas temperature (EGT).</w:t>
+        <w:t>TC1 on SPI1 (PA5/PA6/PB0) monitors exhaust gas temperature (EGT).</w:t>
       </w:r>
     </w:p>
     <w:p>
@@ -3085,7 +3273,7 @@
         <w:rPr>
           <w:sz w:val="22"/>
         </w:rPr>
-        <w:t>TC2 on PB13/PB14/PB12 monitors intake / ambient temperature.</w:t>
+        <w:t>TC2 on SPI2 (PB13/PB14/PB12) monitors intake / ambient temperature.</w:t>
       </w:r>
     </w:p>
     <w:p>
@@ -3137,7 +3325,7 @@
         <w:rPr>
           <w:sz w:val="22"/>
         </w:rPr>
-        <w:t>STM32F103 internal temperature sensor on ADC1 CH16, sampled alongside battery voltage.</w:t>
+        <w:t>STM32F103 internal temperature sensor on ADC1 CH16, sampled in the same DMA scan as battery voltage.</w:t>
       </w:r>
     </w:p>
     <w:p>
@@ -3150,7 +3338,7 @@
         <w:rPr>
           <w:sz w:val="22"/>
         </w:rPr>
-        <w:t>Calibration: V25 = 1.58 V, slope = 4.3 mV/°C (V25 varies chip-to-chip; this value measured empirically).</w:t>
+        <w:t>Calibration: V25 = 1.58 V, slope = 4.3 mV/°C (empirically measured; datasheet typical: V25=1.43 V).</w:t>
       </w:r>
     </w:p>
     <w:p>
@@ -3163,7 +3351,7 @@
         <w:rPr>
           <w:sz w:val="22"/>
         </w:rPr>
-        <w:t>Accuracy: ±2–3 °C — useful as a thermal health indicator for the MCU, not ambient temperature.</w:t>
+        <w:t>Accuracy: ±2–3 °C — useful as a thermal health indicator for the MCU, not for ambient temperature.</w:t>
       </w:r>
     </w:p>
     <w:p>
@@ -3215,7 +3403,7 @@
         <w:rPr>
           <w:sz w:val="22"/>
         </w:rPr>
-        <w:t>Connects to any available COM port at 115200 baud; auto-parses all telemetry lines.</w:t>
+        <w:t>Connects to any available COM port at 115200 baud; auto-detects and parses all telemetry lines.</w:t>
       </w:r>
     </w:p>
     <w:p>
@@ -3228,7 +3416,7 @@
         <w:rPr>
           <w:sz w:val="22"/>
         </w:rPr>
-        <w:t>Live gauges: THROTTLE arc gauge (0–100 %), TACHOMETER arc gauge (placeholder 0–50 000 RPM),</w:t>
+        <w:t>Live gauges: THROTTLE arc gauge (0–100 %), TACHOMETER arc gauge (0–50 000 RPM placeholder),</w:t>
       </w:r>
     </w:p>
     <w:p>
@@ -3241,7 +3429,7 @@
         <w:rPr>
           <w:sz w:val="22"/>
         </w:rPr>
-        <w:t>battery circular gauge, TC1/TC2/MCU vertical thermometers.</w:t>
+        <w:t>battery circular gauge (0–30 V), TC1 / TC2 / MCU vertical thermometer gauges.</w:t>
       </w:r>
     </w:p>
     <w:p>
@@ -3254,7 +3442,7 @@
         <w:rPr>
           <w:sz w:val="22"/>
         </w:rPr>
-        <w:t>FET panel: 2×3 grid with live ON/OFF status LEDs and toggle buttons.</w:t>
+        <w:t>FET panel: 2×4 grid (FET 1/3/5 + ALL HIGH in row 0 ; FET 2/4/6 + ALL LOW in row 1).</w:t>
       </w:r>
     </w:p>
     <w:p>
@@ -3267,7 +3455,7 @@
         <w:rPr>
           <w:sz w:val="22"/>
         </w:rPr>
-        <w:t>RC calibration: SET RC button → step-by-step wizard (center → full throw).</w:t>
+        <w:t>Each FET cell: colour LED, label, HIGH/LOW state text, and action button on the right.</w:t>
       </w:r>
     </w:p>
     <w:p>
@@ -3280,7 +3468,46 @@
         <w:rPr>
           <w:sz w:val="22"/>
         </w:rPr>
-        <w:t>Serial log panel with CLEAR button.</w:t>
+        <w:t>ALL HIGH / ALL LOW styled identically to individual FET buttons for visual consistency.</w:t>
+      </w:r>
+    </w:p>
+    <w:p>
+      <w:pPr>
+        <w:pStyle w:val="ListBullet"/>
+        <w:spacing w:before="20" w:after="20"/>
+        <w:ind w:left="360"/>
+      </w:pPr>
+      <w:r>
+        <w:rPr>
+          <w:sz w:val="22"/>
+        </w:rPr>
+        <w:t>RC calibration: SET RC button → step-by-step wizard (center position → full throw).</w:t>
+      </w:r>
+    </w:p>
+    <w:p>
+      <w:pPr>
+        <w:pStyle w:val="ListBullet"/>
+        <w:spacing w:before="20" w:after="20"/>
+        <w:ind w:left="360"/>
+      </w:pPr>
+      <w:r>
+        <w:rPr>
+          <w:sz w:val="22"/>
+        </w:rPr>
+        <w:t>RESET RC: clears RAM calibration; user must redo SET RC to restore custom mapping.</w:t>
+      </w:r>
+    </w:p>
+    <w:p>
+      <w:pPr>
+        <w:pStyle w:val="ListBullet"/>
+        <w:spacing w:before="20" w:after="20"/>
+        <w:ind w:left="360"/>
+      </w:pPr>
+      <w:r>
+        <w:rPr>
+          <w:sz w:val="22"/>
+        </w:rPr>
+        <w:t>Serial log panel with CLEAR button shows all raw UART output and sent commands.</w:t>
       </w:r>
     </w:p>
     <w:p>
@@ -3548,7 +3775,7 @@
               <w:rPr>
                 <w:sz w:val="20"/>
               </w:rPr>
-              <w:t>Raw ADC count, divider output voltage, calibrated battery voltage</w:t>
+              <w:t>Raw ADC count, divider output, calibrated battery voltage</w:t>
             </w:r>
           </w:p>
         </w:tc>
@@ -3870,6 +4097,70 @@
               <w:rPr>
                 <w:sz w:val="20"/>
               </w:rPr>
+              <w:t>FET_ALL:1</w:t>
+            </w:r>
+          </w:p>
+        </w:tc>
+        <w:tc>
+          <w:tcPr>
+            <w:tcW w:type="dxa" w:w="6520"/>
+            <w:shd w:val="clear" w:color="auto" w:fill="FFFFFF"/>
+            <w:vAlign w:val="center"/>
+          </w:tcPr>
+          <w:p>
+            <w:r>
+              <w:rPr>
+                <w:sz w:val="20"/>
+              </w:rPr>
+              <w:t>Set ALL six FETs HIGH simultaneously. Firmware responds: FET_ALL:1</w:t>
+            </w:r>
+          </w:p>
+        </w:tc>
+      </w:tr>
+      <w:tr>
+        <w:tc>
+          <w:tcPr>
+            <w:tcW w:type="dxa" w:w="2551"/>
+            <w:shd w:val="clear" w:color="auto" w:fill="F2F2F2"/>
+            <w:vAlign w:val="center"/>
+          </w:tcPr>
+          <w:p>
+            <w:r>
+              <w:rPr>
+                <w:sz w:val="20"/>
+              </w:rPr>
+              <w:t>FET_ALL:0</w:t>
+            </w:r>
+          </w:p>
+        </w:tc>
+        <w:tc>
+          <w:tcPr>
+            <w:tcW w:type="dxa" w:w="6520"/>
+            <w:shd w:val="clear" w:color="auto" w:fill="F2F2F2"/>
+            <w:vAlign w:val="center"/>
+          </w:tcPr>
+          <w:p>
+            <w:r>
+              <w:rPr>
+                <w:sz w:val="20"/>
+              </w:rPr>
+              <w:t>Set ALL six FETs LOW simultaneously.  Firmware responds: FET_ALL:0</w:t>
+            </w:r>
+          </w:p>
+        </w:tc>
+      </w:tr>
+      <w:tr>
+        <w:tc>
+          <w:tcPr>
+            <w:tcW w:type="dxa" w:w="2551"/>
+            <w:shd w:val="clear" w:color="auto" w:fill="FFFFFF"/>
+            <w:vAlign w:val="center"/>
+          </w:tcPr>
+          <w:p>
+            <w:r>
+              <w:rPr>
+                <w:sz w:val="20"/>
+              </w:rPr>
               <w:t>CAL_CENTER</w:t>
             </w:r>
           </w:p>
@@ -3885,7 +4176,7 @@
               <w:rPr>
                 <w:sz w:val="20"/>
               </w:rPr>
-              <w:t>Sample 10 RC pulses at stick center; sets 0 % throttle reference. Responds: CAL_CENTER:1531</w:t>
+              <w:t>Sample 10 RC pulses at stick center; sets 0 % throttle reference in RAM. Responds: CAL_CENTER:1540</w:t>
             </w:r>
           </w:p>
         </w:tc>
@@ -3917,7 +4208,7 @@
               <w:rPr>
                 <w:sz w:val="20"/>
               </w:rPr>
-              <w:t>Sample 10 RC pulses at full throw; sets 100 % throttle reference. Responds: CAL_FULL:1950</w:t>
+              <w:t>Sample 10 RC pulses at full throw; sets 100 % throttle reference in RAM. Responds: CAL_FULL:2000</w:t>
             </w:r>
           </w:p>
         </w:tc>
@@ -3949,7 +4240,7 @@
               <w:rPr>
                 <w:sz w:val="20"/>
               </w:rPr>
-              <w:t>Clear RC calibration; throttle returns 0 % until recalibrated. Responds: CAL_RESET:OK</w:t>
+              <w:t>Clear RAM calibration to 0/0; throttle reads 0 % until SET RC is run. Responds: CAL_RESET:OK</w:t>
             </w:r>
           </w:p>
         </w:tc>
@@ -4086,7 +4377,7 @@
         <w:rPr>
           <w:sz w:val="22"/>
         </w:rPr>
-        <w:t>Step 7: Rebuild and flash the firmware. Voltage should now read correctly at both points.</w:t>
+        <w:t>Step 7: Rebuild and flash the firmware. Voltage should now read correctly at both calibration points.</w:t>
       </w:r>
     </w:p>
     <w:p>
@@ -4099,7 +4390,20 @@
           <w:color w:val="007A87"/>
           <w:sz w:val="26"/>
         </w:rPr>
-        <w:t>7.2  RC Throttle Calibration  (via GUI — performed each power cycle)</w:t>
+        <w:t>7.2  RC Throttle Calibration  (optional — GUI-driven)</w:t>
+      </w:r>
+    </w:p>
+    <w:p>
+      <w:pPr>
+        <w:spacing w:before="40" w:after="40"/>
+      </w:pPr>
+      <w:r>
+        <w:rPr>
+          <w:b w:val="0"/>
+          <w:i w:val="0"/>
+          <w:sz w:val="22"/>
+        </w:rPr>
+        <w:t>Firmware ships with default values rc_pw_min = 1540 µs (0 %) and rc_pw_max = 2000 µs (100 %). These match the measured neutral and full-throw positions on this board and allow the throttle to function immediately without user calibration. Use SET RC only if the defaults do not match your transmitter or after running RESET RC.</w:t>
       </w:r>
     </w:p>
     <w:p>
@@ -4138,7 +4442,7 @@
         <w:rPr>
           <w:sz w:val="22"/>
         </w:rPr>
-        <w:t>Step 3: In the GUI, click SET RC → OK at Step 1 prompt. Firmware averages 10 pulses and sets the 0 % reference.</w:t>
+        <w:t>Step 3: In the GUI, click SET RC → OK at Step 1 prompt. Firmware averages 10 pulses → stores as 0 % reference.</w:t>
       </w:r>
     </w:p>
     <w:p>
@@ -4164,7 +4468,7 @@
         <w:rPr>
           <w:sz w:val="22"/>
         </w:rPr>
-        <w:t>Step 5: Click OK at Step 2 prompt. Firmware averages 10 pulses and sets the 100 % reference.</w:t>
+        <w:t>Step 5: Click OK at Step 2 prompt. Firmware averages 10 pulses → stores as 100 % reference.</w:t>
       </w:r>
     </w:p>
     <w:p>
@@ -4177,7 +4481,20 @@
         <w:rPr>
           <w:sz w:val="22"/>
         </w:rPr>
-        <w:t>Step 6: THR: value now tracks stick position from 0 to 100. Use RESET RC to clear and recalibrate.</w:t>
+        <w:t>Step 6: THR: value now tracks stick position from 0 to 100.</w:t>
+      </w:r>
+    </w:p>
+    <w:p>
+      <w:pPr>
+        <w:pStyle w:val="ListBullet"/>
+        <w:spacing w:before="20" w:after="20"/>
+        <w:ind w:left="360"/>
+      </w:pPr>
+      <w:r>
+        <w:rPr>
+          <w:sz w:val="22"/>
+        </w:rPr>
+        <w:t>Step 7: Click RESET RC at any time to clear the RAM calibration; throttle returns 0 % until SET RC is re-run.</w:t>
       </w:r>
     </w:p>
     <w:p>
@@ -4191,7 +4508,7 @@
           <w:color w:val="777777"/>
           <w:sz w:val="22"/>
         </w:rPr>
-        <w:t>Note: calibration is stored in RAM only — it is lost on power cycle and must be repeated each session.</w:t>
+        <w:t>Note: SET RC and RESET RC operate on RAM only — values are lost on power cycle. Firmware defaults (1540 / 2000) are automatically restored at next boot.</w:t>
       </w:r>
     </w:p>
     <w:p>
@@ -4309,7 +4626,7 @@
         <w:rPr>
           <w:sz w:val="22"/>
         </w:rPr>
-        <w:t>Changed UART2 RX DMA to Normal mode in the .ioc configuration file. The DMA restarts cleanly after each line received via the IDLE callback.</w:t>
+        <w:t>Changed UART2 RX DMA to Normal mode in the .ioc configuration. The DMA restarts cleanly after each line received via the IDLE callback.</w:t>
       </w:r>
     </w:p>
     <w:p>
@@ -4341,7 +4658,7 @@
         <w:rPr>
           <w:sz w:val="22"/>
         </w:rPr>
-        <w:t>Firmware was reading a single DMA ADC sample which captured high-frequency noise. Additionally, the ADC had a zero-offset (reads ~0.15–0.17 V at 0 V actual input).</w:t>
+        <w:t>Firmware was reading a single DMA ADC sample capturing high-frequency noise. Additionally the ADC had a zero-offset (~0.15–0.17 V at 0 V actual input).</w:t>
       </w:r>
     </w:p>
     <w:p>
@@ -4360,7 +4677,7 @@
         <w:rPr>
           <w:sz w:val="22"/>
         </w:rPr>
-        <w:t>Implemented 64-sample averaging with 1 ms delay between samples. Added a raw-count zero-offset calibration constant (VBATT_RAW_ZERO) to clamp the noise floor to 0.00 V.</w:t>
+        <w:t>Implemented 64-sample averaging with 1 ms delay between samples. Added a raw-count zero-offset calibration constant (VBATT_RAW_ZERO = 190) to clamp the noise floor to 0.00 V.</w:t>
       </w:r>
     </w:p>
     <w:p>
@@ -4373,7 +4690,7 @@
           <w:color w:val="007A87"/>
           <w:sz w:val="26"/>
         </w:rPr>
-        <w:t>Issue: Battery voltage showing ~0.38 V at 0 V input and ~25 V at ~24 V input after initial calibration</w:t>
+        <w:t>Issue: Battery voltage showing ~0.38 V at 0 V input after initial calibration attempt</w:t>
       </w:r>
     </w:p>
     <w:p>
@@ -4392,7 +4709,7 @@
         <w:rPr>
           <w:sz w:val="22"/>
         </w:rPr>
-        <w:t>Initial calibration constants were derived from single-sample (non-averaged) measurements. After enabling 64-sample averaging, the ADC baseline shifted significantly — the zero-offset raw count changed from ~55 to ~183, making the old constants invalid.</w:t>
+        <w:t>Initial calibration constants were derived from single-sample (non-averaged) measurements. After enabling 64-sample averaging the ADC baseline shifted — zero-offset raw count changed from ~55 to ~183, making old constants invalid.</w:t>
       </w:r>
     </w:p>
     <w:p>
@@ -4411,7 +4728,7 @@
         <w:rPr>
           <w:sz w:val="22"/>
         </w:rPr>
-        <w:t>Switched to a raw-count based two-point calibration formula that bypasses the intermediate resistor-divider formula entirely. This eliminates cascaded rounding errors. Constants updated from board measurements: VBATT_RAW_ZERO = 190, VBATT_RAW_CAL = 3923.</w:t>
+        <w:t>Switched to a raw-count two-point calibration formula that bypasses the resistor-divider intermediate calculation entirely. Constants updated from board measurements: VBATT_RAW_ZERO = 190, VBATT_RAW_CAL = 3923 at 24.00 V.</w:t>
       </w:r>
     </w:p>
     <w:p>
@@ -4424,7 +4741,7 @@
           <w:color w:val="007A87"/>
           <w:sz w:val="26"/>
         </w:rPr>
-        <w:t>Issue: RC throttle always reading 0 % — THR: 0 regardless of stick position</w:t>
+        <w:t>Issue: RC throttle always reading 0 % (THR: 0) regardless of stick position</w:t>
       </w:r>
     </w:p>
     <w:p>
@@ -4443,7 +4760,7 @@
         <w:rPr>
           <w:sz w:val="22"/>
         </w:rPr>
-        <w:t>Initially diagnosed using ADC on PA0. ADC showed ~0.3 V constant because it was averaging the 7.5 % duty-cycle RC PWM signal (1500 µs HIGH out of 20 ms period), not seeing the digital pulses. Pin was in Analog mode, not GPIO Input mode.</w:t>
+        <w:t>PA0 was configured as ADC input. ADC showed ~0.3 V constant because it was averaging the 7.5 % duty-cycle PWM (1500 µs HIGH out of 20 ms period), not seeing the individual pulses.</w:t>
       </w:r>
     </w:p>
     <w:p>
@@ -4462,7 +4779,7 @@
         <w:rPr>
           <w:sz w:val="22"/>
         </w:rPr>
-        <w:t>Removed ADC2 from .ioc and reconfigured PA0 as GPIO_Input. Implemented pulseIn_us() using DWT cycle counter — directly times the HIGH pulse width. Timeout increased to 50 ms to account for FreeRTOS task scheduling jitter. Debug print of raw pulse width (PW: xxxx) confirmed signal received (1530–1950 µs). After calibration, THR: now tracks correctly from 0 to 100.</w:t>
+        <w:t>Removed ADC2 from .ioc; reconfigured PA0 as GPIO_Input. Implemented pulseIn_us() using DWT cycle counter to time HIGH pulses directly. Timeout increased to 50 ms to account for FreeRTOS scheduling jitter. Confirmed 1530–1950 µs signal via debug print. Throttle now maps correctly 0–100 %.</w:t>
       </w:r>
     </w:p>
     <w:p>
@@ -4475,7 +4792,7 @@
           <w:color w:val="007A87"/>
           <w:sz w:val="26"/>
         </w:rPr>
-        <w:t>Issue: RC throttle 0 % at center after calibration (THR: 0 even with signal)</w:t>
+        <w:t>Issue: RC throttle stuck at 0 % after CAL_CENTER (THR: 0 with valid signal)</w:t>
       </w:r>
     </w:p>
     <w:p>
@@ -4494,7 +4811,7 @@
         <w:rPr>
           <w:sz w:val="22"/>
         </w:rPr>
-        <w:t>CAL_CENTER was sampling with a 20-sample average but the sample_rc_pw function was returning 0 when samples failed the 900–2100 µs validity check, causing rc_pw_min and rc_pw_max to both be 0.</w:t>
+        <w:t>sample_rc_pw() was using 20 samples with a tight valid-range check; some samples failed the 900–2100 µs gate, causing the average to come out 0, setting rc_pw_min = 0 and rc_pw_max = 0.</w:t>
       </w:r>
     </w:p>
     <w:p>
@@ -4513,7 +4830,7 @@
         <w:rPr>
           <w:sz w:val="22"/>
         </w:rPr>
-        <w:t>Reduced to 10 samples (faster), verified pulseIn_us returns valid values via debug print, confirmed calibration stores correctly. Throttle mapping now works correctly across full range.</w:t>
+        <w:t>Reduced to 10 samples (faster, less chance of gating failure); verified pulseIn_us returns valid values via debug print. Throttle mapping now works correctly across full range.</w:t>
       </w:r>
     </w:p>
     <w:p>
@@ -4555,7 +4872,7 @@
           <w:color w:val="1E7E34"/>
           <w:sz w:val="22"/>
         </w:rPr>
-        <w:t>✓  Battery voltage — 64-sample averaged, two-point calibrated, accurate to ±0.05 V</w:t>
+        <w:t>✓  Battery voltage — 64-sample averaged, two-point raw-count calibrated, accurate to ±0.05 V</w:t>
       </w:r>
     </w:p>
     <w:p>
@@ -4568,7 +4885,7 @@
           <w:color w:val="1E7E34"/>
           <w:sz w:val="22"/>
         </w:rPr>
-        <w:t>✓  RC throttle input — pulseIn GPIO polling, calibrated, spike filter, 0–100 % output</w:t>
+        <w:t>✓  RC throttle — GPIO pulseIn, default cal (1540/2000 µs), spike filter, hold-last-valid, 0–100 % output</w:t>
       </w:r>
     </w:p>
     <w:p>
@@ -4581,7 +4898,20 @@
           <w:color w:val="1E7E34"/>
           <w:sz w:val="22"/>
         </w:rPr>
-        <w:t>✓  Six FET outputs — GUI toggle control + 200 ms state reporting</w:t>
+        <w:t>✓  Six FET outputs — individual toggle + ALL HIGH / ALL LOW group control</w:t>
+      </w:r>
+    </w:p>
+    <w:p>
+      <w:pPr>
+        <w:pStyle w:val="ListBullet"/>
+        <w:spacing w:before="20" w:after="20"/>
+      </w:pPr>
+      <w:r>
+        <w:rPr>
+          <w:color w:val="1E7E34"/>
+          <w:sz w:val="22"/>
+        </w:rPr>
+        <w:t>✓  FET group commands — FET_ALL:1 and FET_ALL:0 iterate all 6 pins in firmware</w:t>
       </w:r>
     </w:p>
     <w:p>
@@ -4607,7 +4937,7 @@
           <w:color w:val="1E7E34"/>
           <w:sz w:val="22"/>
         </w:rPr>
-        <w:t>✓  Thermocouple TC1 + TC2 (MAX31855) — temperature reporting every 250 ms</w:t>
+        <w:t>✓  Thermocouple TC1 + TC2 (MAX31855) — temperature reporting every 250 ms via SPI</w:t>
       </w:r>
     </w:p>
     <w:p>
@@ -4620,7 +4950,7 @@
           <w:color w:val="1E7E34"/>
           <w:sz w:val="22"/>
         </w:rPr>
-        <w:t>✓  UART telemetry — all channels multiplexed on UART2, 115200 baud</w:t>
+        <w:t>✓  UART telemetry — all channels on UART2, 115200 baud, DMA RX + blocking TX</w:t>
       </w:r>
     </w:p>
     <w:p>
@@ -4646,7 +4976,7 @@
           <w:color w:val="1E7E34"/>
           <w:sz w:val="22"/>
         </w:rPr>
-        <w:t>✓  PC Python GUI — live gauges, FET panel, RC calibration wizard, serial log</w:t>
+        <w:t>✓  PC Python GUI — live gauges, 2×4 FET panel, RC calibration wizard, serial log</w:t>
       </w:r>
     </w:p>
     <w:p>
@@ -4679,7 +5009,7 @@
         <w:rPr>
           <w:sz w:val="22"/>
         </w:rPr>
-        <w:t>Pulse-counting via external interrupt on PC14. Output format: RPM: xxxxx at 1000 ms intervals. GUI tachometer gauge is ready and waiting for this data.</w:t>
+        <w:t>Pulse-counting via external interrupt on PC14. Output format: RPM: xxxxx at 1000 ms intervals. GUI tachometer gauge is already implemented and waiting for this data.</w:t>
       </w:r>
     </w:p>
     <w:p>
@@ -4699,7 +5029,27 @@
         <w:rPr>
           <w:sz w:val="22"/>
         </w:rPr>
-        <w:t>VBATT_RAW_CAL was estimated from derived measurements. For maximum accuracy: connect a verified 24.00 V reference, read Raw: value, update VBATT_RAW_CAL, and reflash.</w:t>
+        <w:t>VBATT_RAW_CAL was set from estimated measurements. For maximum accuracy: connect a verified 24.00 V reference, observe Raw: value, update VBATT_RAW_CAL, and reflash the firmware.</w:t>
+      </w:r>
+    </w:p>
+    <w:p>
+      <w:pPr>
+        <w:pStyle w:val="ListBullet"/>
+        <w:spacing w:before="40" w:after="40"/>
+      </w:pPr>
+      <w:r>
+        <w:rPr>
+          <w:b/>
+          <w:color w:val="D96500"/>
+          <w:sz w:val="22"/>
+        </w:rPr>
+        <w:t xml:space="preserve">○  Thermocouple port to CubeIDE — </w:t>
+      </w:r>
+      <w:r>
+        <w:rPr>
+          <w:sz w:val="22"/>
+        </w:rPr>
+        <w:t>TC1/TC2 SPI reading is currently only in the original Arduino firmware. The CubeIDE firmware has SPI1/SPI2 configured but the MAX31855 read routine has not yet been ported to the STM32 HAL SPI API.</w:t>
       </w:r>
     </w:p>
     <w:p>
@@ -4804,7 +5154,7 @@
               <w:rPr>
                 <w:sz w:val="20"/>
               </w:rPr>
-              <w:t>RC PWM neutral</w:t>
+              <w:t>RC PWM default min (0 %)</w:t>
             </w:r>
           </w:p>
         </w:tc>
@@ -4819,7 +5169,7 @@
               <w:rPr>
                 <w:sz w:val="20"/>
               </w:rPr>
-              <w:t>~1530 µs</w:t>
+              <w:t>1540 µs</w:t>
             </w:r>
           </w:p>
         </w:tc>
@@ -4834,7 +5184,7 @@
               <w:rPr>
                 <w:sz w:val="20"/>
               </w:rPr>
-              <w:t>Measured on this board; typical range 1490–1510 µs</w:t>
+              <w:t>Hardcoded firmware default — measured neutral on this board</w:t>
             </w:r>
           </w:p>
         </w:tc>
@@ -4851,7 +5201,7 @@
               <w:rPr>
                 <w:sz w:val="20"/>
               </w:rPr>
-              <w:t>RC PWM full throttle</w:t>
+              <w:t>RC PWM default max (100 %)</w:t>
             </w:r>
           </w:p>
         </w:tc>
@@ -4866,7 +5216,7 @@
               <w:rPr>
                 <w:sz w:val="20"/>
               </w:rPr>
-              <w:t>~1950 µs</w:t>
+              <w:t>2000 µs</w:t>
             </w:r>
           </w:p>
         </w:tc>
@@ -4881,7 +5231,7 @@
               <w:rPr>
                 <w:sz w:val="20"/>
               </w:rPr>
-              <w:t>Measured on this board; typical range 1950–2000 µs</w:t>
+              <w:t>Hardcoded firmware default — standard RC full throw</w:t>
             </w:r>
           </w:p>
         </w:tc>
@@ -4928,7 +5278,7 @@
               <w:rPr>
                 <w:sz w:val="20"/>
               </w:rPr>
-              <w:t>Readings outside this range are discarded</w:t>
+              <w:t>Readings outside this range are discarded by ThrottleTask</w:t>
             </w:r>
           </w:p>
         </w:tc>
@@ -4992,7 +5342,7 @@
               <w:rPr>
                 <w:sz w:val="20"/>
               </w:rPr>
-              <w:t>RC signal loss timeout</w:t>
+              <w:t>RC signal-loss timeout</w:t>
             </w:r>
           </w:p>
         </w:tc>
@@ -5022,7 +5372,7 @@
               <w:rPr>
                 <w:sz w:val="20"/>
               </w:rPr>
-              <w:t>After this, throttle resets to center (0 % calibrated)</w:t>
+              <w:t>After this, throttle resets to hold-last-valid then 0 %</w:t>
             </w:r>
           </w:p>
         </w:tc>
@@ -5069,7 +5419,7 @@
               <w:rPr>
                 <w:sz w:val="20"/>
               </w:rPr>
-              <w:t>Covers full 20 ms RC period plus FreeRTOS jitter margin</w:t>
+              <w:t>Covers 20 ms RC period + FreeRTOS scheduling jitter margin</w:t>
             </w:r>
           </w:p>
         </w:tc>
@@ -5086,7 +5436,7 @@
               <w:rPr>
                 <w:sz w:val="20"/>
               </w:rPr>
-              <w:t>VBATT_RAW_ZERO</w:t>
+              <w:t>CAL_CENTER / CAL_FULL samples</w:t>
             </w:r>
           </w:p>
         </w:tc>
@@ -5101,7 +5451,7 @@
               <w:rPr>
                 <w:sz w:val="20"/>
               </w:rPr>
-              <w:t>190</w:t>
+              <w:t>10 pulses averaged</w:t>
             </w:r>
           </w:p>
         </w:tc>
@@ -5116,7 +5466,7 @@
               <w:rPr>
                 <w:sz w:val="20"/>
               </w:rPr>
-              <w:t>Raw ADC count at 0 V battery input (noise floor)</w:t>
+              <w:t>RAM-only; lost on power cycle; defaults restored at boot</w:t>
             </w:r>
           </w:p>
         </w:tc>
@@ -5133,7 +5483,7 @@
               <w:rPr>
                 <w:sz w:val="20"/>
               </w:rPr>
-              <w:t>VBATT_RAW_CAL</w:t>
+              <w:t>VBATT_RAW_ZERO</w:t>
             </w:r>
           </w:p>
         </w:tc>
@@ -5148,7 +5498,7 @@
               <w:rPr>
                 <w:sz w:val="20"/>
               </w:rPr>
-              <w:t>3923</w:t>
+              <w:t>190</w:t>
             </w:r>
           </w:p>
         </w:tc>
@@ -5163,7 +5513,7 @@
               <w:rPr>
                 <w:sz w:val="20"/>
               </w:rPr>
-              <w:t>Raw ADC count at VBATT_MV_CAL reference voltage</w:t>
+              <w:t>Raw ADC count at 0 V battery input (noise floor clamp)</w:t>
             </w:r>
           </w:p>
         </w:tc>
@@ -5180,7 +5530,7 @@
               <w:rPr>
                 <w:sz w:val="20"/>
               </w:rPr>
-              <w:t>VBATT_MV_CAL</w:t>
+              <w:t>VBATT_RAW_CAL</w:t>
             </w:r>
           </w:p>
         </w:tc>
@@ -5195,7 +5545,7 @@
               <w:rPr>
                 <w:sz w:val="20"/>
               </w:rPr>
-              <w:t>24000 mV</w:t>
+              <w:t>3923</w:t>
             </w:r>
           </w:p>
         </w:tc>
@@ -5210,7 +5560,7 @@
               <w:rPr>
                 <w:sz w:val="20"/>
               </w:rPr>
-              <w:t>Known accurate voltage at calibration point</w:t>
+              <w:t>Raw ADC count at the 24 V calibration reference</w:t>
             </w:r>
           </w:p>
         </w:tc>
@@ -5227,7 +5577,7 @@
               <w:rPr>
                 <w:sz w:val="20"/>
               </w:rPr>
-              <w:t>Voltage divider ratio</w:t>
+              <w:t>VBATT_MV_CAL</w:t>
             </w:r>
           </w:p>
         </w:tc>
@@ -5242,6 +5592,53 @@
               <w:rPr>
                 <w:sz w:val="20"/>
               </w:rPr>
+              <w:t>24000 mV</w:t>
+            </w:r>
+          </w:p>
+        </w:tc>
+        <w:tc>
+          <w:tcPr>
+            <w:tcW w:type="dxa" w:w="4535"/>
+            <w:shd w:val="clear" w:color="auto" w:fill="FFFFFF"/>
+            <w:vAlign w:val="center"/>
+          </w:tcPr>
+          <w:p>
+            <w:r>
+              <w:rPr>
+                <w:sz w:val="20"/>
+              </w:rPr>
+              <w:t>Known accurate voltage at VBATT_RAW_CAL calibration point</w:t>
+            </w:r>
+          </w:p>
+        </w:tc>
+      </w:tr>
+      <w:tr>
+        <w:tc>
+          <w:tcPr>
+            <w:tcW w:type="dxa" w:w="2551"/>
+            <w:shd w:val="clear" w:color="auto" w:fill="F2F2F2"/>
+            <w:vAlign w:val="center"/>
+          </w:tcPr>
+          <w:p>
+            <w:r>
+              <w:rPr>
+                <w:sz w:val="20"/>
+              </w:rPr>
+              <w:t>Voltage divider ratio</w:t>
+            </w:r>
+          </w:p>
+        </w:tc>
+        <w:tc>
+          <w:tcPr>
+            <w:tcW w:type="dxa" w:w="1984"/>
+            <w:shd w:val="clear" w:color="auto" w:fill="F2F2F2"/>
+            <w:vAlign w:val="center"/>
+          </w:tcPr>
+          <w:p>
+            <w:r>
+              <w:rPr>
+                <w:sz w:val="20"/>
+              </w:rPr>
               <w:t>44600 / 5600 ≈ 7.96×</w:t>
             </w:r>
           </w:p>
@@ -5249,7 +5646,7 @@
         <w:tc>
           <w:tcPr>
             <w:tcW w:type="dxa" w:w="4535"/>
-            <w:shd w:val="clear" w:color="auto" w:fill="FFFFFF"/>
+            <w:shd w:val="clear" w:color="auto" w:fill="F2F2F2"/>
             <w:vAlign w:val="center"/>
           </w:tcPr>
           <w:p>
@@ -5266,7 +5663,7 @@
         <w:tc>
           <w:tcPr>
             <w:tcW w:type="dxa" w:w="2551"/>
-            <w:shd w:val="clear" w:color="auto" w:fill="F2F2F2"/>
+            <w:shd w:val="clear" w:color="auto" w:fill="FFFFFF"/>
             <w:vAlign w:val="center"/>
           </w:tcPr>
           <w:p>
@@ -5281,7 +5678,7 @@
         <w:tc>
           <w:tcPr>
             <w:tcW w:type="dxa" w:w="1984"/>
-            <w:shd w:val="clear" w:color="auto" w:fill="F2F2F2"/>
+            <w:shd w:val="clear" w:color="auto" w:fill="FFFFFF"/>
             <w:vAlign w:val="center"/>
           </w:tcPr>
           <w:p>
@@ -5296,7 +5693,7 @@
         <w:tc>
           <w:tcPr>
             <w:tcW w:type="dxa" w:w="4535"/>
-            <w:shd w:val="clear" w:color="auto" w:fill="F2F2F2"/>
+            <w:shd w:val="clear" w:color="auto" w:fill="FFFFFF"/>
             <w:vAlign w:val="center"/>
           </w:tcPr>
           <w:p>
@@ -5313,7 +5710,7 @@
         <w:tc>
           <w:tcPr>
             <w:tcW w:type="dxa" w:w="2551"/>
-            <w:shd w:val="clear" w:color="auto" w:fill="FFFFFF"/>
+            <w:shd w:val="clear" w:color="auto" w:fill="F2F2F2"/>
             <w:vAlign w:val="center"/>
           </w:tcPr>
           <w:p>
@@ -5328,7 +5725,7 @@
         <w:tc>
           <w:tcPr>
             <w:tcW w:type="dxa" w:w="1984"/>
-            <w:shd w:val="clear" w:color="auto" w:fill="FFFFFF"/>
+            <w:shd w:val="clear" w:color="auto" w:fill="F2F2F2"/>
             <w:vAlign w:val="center"/>
           </w:tcPr>
           <w:p>
@@ -5343,7 +5740,7 @@
         <w:tc>
           <w:tcPr>
             <w:tcW w:type="dxa" w:w="4535"/>
-            <w:shd w:val="clear" w:color="auto" w:fill="FFFFFF"/>
+            <w:shd w:val="clear" w:color="auto" w:fill="F2F2F2"/>
             <w:vAlign w:val="center"/>
           </w:tcPr>
           <w:p>
@@ -5360,7 +5757,7 @@
         <w:tc>
           <w:tcPr>
             <w:tcW w:type="dxa" w:w="2551"/>
-            <w:shd w:val="clear" w:color="auto" w:fill="F2F2F2"/>
+            <w:shd w:val="clear" w:color="auto" w:fill="FFFFFF"/>
             <w:vAlign w:val="center"/>
           </w:tcPr>
           <w:p>
@@ -5375,7 +5772,7 @@
         <w:tc>
           <w:tcPr>
             <w:tcW w:type="dxa" w:w="1984"/>
-            <w:shd w:val="clear" w:color="auto" w:fill="F2F2F2"/>
+            <w:shd w:val="clear" w:color="auto" w:fill="FFFFFF"/>
             <w:vAlign w:val="center"/>
           </w:tcPr>
           <w:p>
@@ -5390,7 +5787,7 @@
         <w:tc>
           <w:tcPr>
             <w:tcW w:type="dxa" w:w="4535"/>
-            <w:shd w:val="clear" w:color="auto" w:fill="F2F2F2"/>
+            <w:shd w:val="clear" w:color="auto" w:fill="FFFFFF"/>
             <w:vAlign w:val="center"/>
           </w:tcPr>
           <w:p>
@@ -5407,7 +5804,7 @@
         <w:tc>
           <w:tcPr>
             <w:tcW w:type="dxa" w:w="2551"/>
-            <w:shd w:val="clear" w:color="auto" w:fill="FFFFFF"/>
+            <w:shd w:val="clear" w:color="auto" w:fill="F2F2F2"/>
             <w:vAlign w:val="center"/>
           </w:tcPr>
           <w:p>
@@ -5422,7 +5819,7 @@
         <w:tc>
           <w:tcPr>
             <w:tcW w:type="dxa" w:w="1984"/>
-            <w:shd w:val="clear" w:color="auto" w:fill="FFFFFF"/>
+            <w:shd w:val="clear" w:color="auto" w:fill="F2F2F2"/>
             <w:vAlign w:val="center"/>
           </w:tcPr>
           <w:p>
@@ -5437,6 +5834,23 @@
         <w:tc>
           <w:tcPr>
             <w:tcW w:type="dxa" w:w="4535"/>
+            <w:shd w:val="clear" w:color="auto" w:fill="F2F2F2"/>
+            <w:vAlign w:val="center"/>
+          </w:tcPr>
+          <w:p>
+            <w:r>
+              <w:rPr>
+                <w:sz w:val="20"/>
+              </w:rPr>
+              <w:t>Internal temp sensor V25 (empirically measured; datasheet typical = 1.43 V)</w:t>
+            </w:r>
+          </w:p>
+        </w:tc>
+      </w:tr>
+      <w:tr>
+        <w:tc>
+          <w:tcPr>
+            <w:tcW w:type="dxa" w:w="2551"/>
             <w:shd w:val="clear" w:color="auto" w:fill="FFFFFF"/>
             <w:vAlign w:val="center"/>
           </w:tcPr>
@@ -5445,7 +5859,37 @@
               <w:rPr>
                 <w:sz w:val="20"/>
               </w:rPr>
-              <w:t>Internal temperature sensor V25 (chip-specific; datasheet typical = 1.43 V)</w:t>
+              <w:t>MCU temp slope</w:t>
+            </w:r>
+          </w:p>
+        </w:tc>
+        <w:tc>
+          <w:tcPr>
+            <w:tcW w:type="dxa" w:w="1984"/>
+            <w:shd w:val="clear" w:color="auto" w:fill="FFFFFF"/>
+            <w:vAlign w:val="center"/>
+          </w:tcPr>
+          <w:p>
+            <w:r>
+              <w:rPr>
+                <w:sz w:val="20"/>
+              </w:rPr>
+              <w:t>4.3 mV / °C</w:t>
+            </w:r>
+          </w:p>
+        </w:tc>
+        <w:tc>
+          <w:tcPr>
+            <w:tcW w:type="dxa" w:w="4535"/>
+            <w:shd w:val="clear" w:color="auto" w:fill="FFFFFF"/>
+            <w:vAlign w:val="center"/>
+          </w:tcPr>
+          <w:p>
+            <w:r>
+              <w:rPr>
+                <w:sz w:val="20"/>
+              </w:rPr>
+              <w:t>Internal temperature sensor slope</w:t>
             </w:r>
           </w:p>
         </w:tc>
@@ -5462,7 +5906,7 @@
               <w:rPr>
                 <w:sz w:val="20"/>
               </w:rPr>
-              <w:t>MCU temp slope</w:t>
+              <w:t>UART baud rate</w:t>
             </w:r>
           </w:p>
         </w:tc>
@@ -5477,7 +5921,7 @@
               <w:rPr>
                 <w:sz w:val="20"/>
               </w:rPr>
-              <w:t>4.3 mV / °C</w:t>
+              <w:t>115200</w:t>
             </w:r>
           </w:p>
         </w:tc>
@@ -5492,7 +5936,7 @@
               <w:rPr>
                 <w:sz w:val="20"/>
               </w:rPr>
-              <w:t>Internal temperature sensor slope</w:t>
+              <w:t>8N1, no flow control</w:t>
             </w:r>
           </w:p>
         </w:tc>
@@ -5509,7 +5953,7 @@
               <w:rPr>
                 <w:sz w:val="20"/>
               </w:rPr>
-              <w:t>UART baud rate</w:t>
+              <w:t>FreeRTOS heap</w:t>
             </w:r>
           </w:p>
         </w:tc>
@@ -5524,7 +5968,7 @@
               <w:rPr>
                 <w:sz w:val="20"/>
               </w:rPr>
-              <w:t>115200</w:t>
+              <w:t>8192 bytes</w:t>
             </w:r>
           </w:p>
         </w:tc>
@@ -5539,7 +5983,7 @@
               <w:rPr>
                 <w:sz w:val="20"/>
               </w:rPr>
-              <w:t>8N1, no flow control</w:t>
+              <w:t>Total FreeRTOS heap (set in .ioc)</w:t>
             </w:r>
           </w:p>
         </w:tc>
@@ -5556,7 +6000,7 @@
               <w:rPr>
                 <w:sz w:val="20"/>
               </w:rPr>
-              <w:t>FreeRTOS heap</w:t>
+              <w:t>Task stack size</w:t>
             </w:r>
           </w:p>
         </w:tc>
@@ -5571,7 +6015,7 @@
               <w:rPr>
                 <w:sz w:val="20"/>
               </w:rPr>
-              <w:t>8192 bytes</w:t>
+              <w:t>1024 bytes</w:t>
             </w:r>
           </w:p>
         </w:tc>
@@ -5579,53 +6023,6 @@
           <w:tcPr>
             <w:tcW w:type="dxa" w:w="4535"/>
             <w:shd w:val="clear" w:color="auto" w:fill="F2F2F2"/>
-            <w:vAlign w:val="center"/>
-          </w:tcPr>
-          <w:p>
-            <w:r>
-              <w:rPr>
-                <w:sz w:val="20"/>
-              </w:rPr>
-              <w:t>Total FreeRTOS heap</w:t>
-            </w:r>
-          </w:p>
-        </w:tc>
-      </w:tr>
-      <w:tr>
-        <w:tc>
-          <w:tcPr>
-            <w:tcW w:type="dxa" w:w="2551"/>
-            <w:shd w:val="clear" w:color="auto" w:fill="FFFFFF"/>
-            <w:vAlign w:val="center"/>
-          </w:tcPr>
-          <w:p>
-            <w:r>
-              <w:rPr>
-                <w:sz w:val="20"/>
-              </w:rPr>
-              <w:t>Task stack size</w:t>
-            </w:r>
-          </w:p>
-        </w:tc>
-        <w:tc>
-          <w:tcPr>
-            <w:tcW w:type="dxa" w:w="1984"/>
-            <w:shd w:val="clear" w:color="auto" w:fill="FFFFFF"/>
-            <w:vAlign w:val="center"/>
-          </w:tcPr>
-          <w:p>
-            <w:r>
-              <w:rPr>
-                <w:sz w:val="20"/>
-              </w:rPr>
-              <w:t>1024 bytes</w:t>
-            </w:r>
-          </w:p>
-        </w:tc>
-        <w:tc>
-          <w:tcPr>
-            <w:tcW w:type="dxa" w:w="4535"/>
-            <w:shd w:val="clear" w:color="auto" w:fill="FFFFFF"/>
             <w:vAlign w:val="center"/>
           </w:tcPr>
           <w:p>

</xml_diff>

<commit_message>
Fix battery voltage calibration for direct-supply power, reduce ADC jitter, update docs
</commit_message>
<xml_diff>
--- a/JET ECU Firmware/JET_ECU_Project_Documentation.docx
+++ b/JET ECU Firmware/JET_ECU_Project_Documentation.docx
@@ -43,7 +43,7 @@
           <w:color w:val="555555"/>
           <w:sz w:val="22"/>
         </w:rPr>
-        <w:t>Date: June 30, 2026</w:t>
+        <w:t>Date: July 01, 2026</w:t>
       </w:r>
     </w:p>
     <w:p>
@@ -2124,7 +2124,7 @@
               <w:rPr>
                 <w:sz w:val="20"/>
               </w:rPr>
-              <w:t>500 ms</w:t>
+              <w:t>~756 ms</w:t>
             </w:r>
           </w:p>
         </w:tc>
@@ -2139,7 +2139,7 @@
               <w:rPr>
                 <w:sz w:val="20"/>
               </w:rPr>
-              <w:t>Averages 64 ADC DMA samples (1 ms apart) for battery voltage, applies two-point raw-count calibration. Reads MCU die temp every 1000 ms.</w:t>
+              <w:t>Averages 256 ADC DMA samples (1 ms apart) for battery voltage, applies two-point linear calibration. Reads MCU die temp every ~1512 ms.</w:t>
             </w:r>
           </w:p>
         </w:tc>
@@ -2753,7 +2753,7 @@
         <w:rPr>
           <w:sz w:val="22"/>
         </w:rPr>
-        <w:t>64-sample averaging with 1 ms delay between samples eliminates high-frequency noise.</w:t>
+        <w:t>256-sample averaging with 1 ms delay between samples (increased from an initial 64) — halves report-to-report ADC jitter with no added lag, since each report is computed independently (no memory carried between reports, so a real voltage change still shows on the next report).</w:t>
       </w:r>
     </w:p>
     <w:p>
@@ -2766,7 +2766,7 @@
         <w:rPr>
           <w:sz w:val="22"/>
         </w:rPr>
-        <w:t>Two-point raw-count calibration removes ADC zero offset and gain error:</w:t>
+        <w:t>Two-point direct linear interpolation between two known (raw, voltage) points — no forced "0 V" anchor, since that raw value drifts whenever the sense line’s ground reference changes (e.g. powering the board from the battery supply vs. from USB):</w:t>
       </w:r>
     </w:p>
     <w:p>
@@ -2779,7 +2779,7 @@
         <w:rPr>
           <w:sz w:val="22"/>
         </w:rPr>
-        <w:t>VBATT_RAW_ZERO = 190  →  raw count ≤ 190 reports 0.00 V (eliminates ~0.15 V noise floor)</w:t>
+        <w:t>VBATT_RAW_LO = 678 at VBATT_MV_LO = 5000 mV   (low anchor point)</w:t>
       </w:r>
     </w:p>
     <w:p>
@@ -2792,7 +2792,7 @@
         <w:rPr>
           <w:sz w:val="22"/>
         </w:rPr>
-        <w:t>VBATT_RAW_CAL  = 3923 at VBATT_MV_CAL = 24000 mV  →  full-scale calibration point</w:t>
+        <w:t>VBATT_RAW_HI = 3608 at VBATT_MV_HI = 24000 mV  (high anchor point)</w:t>
       </w:r>
     </w:p>
     <w:p>
@@ -2805,20 +2805,46 @@
         <w:rPr>
           <w:sz w:val="22"/>
         </w:rPr>
-        <w:t>Formula:  V_batt (mV) = (raw − RAW_ZERO) × MV_CAL / (RAW_CAL − RAW_ZERO)</w:t>
+        <w:t>Formula:  V_batt (mV) = MV_LO + (raw − RAW_LO) × (MV_HI − MV_LO) / (RAW_HI − RAW_LO)</w:t>
       </w:r>
     </w:p>
     <w:p>
       <w:pPr>
         <w:pStyle w:val="ListBullet"/>
         <w:spacing w:before="20" w:after="20"/>
-        <w:ind w:left="360"/>
+        <w:ind w:left="720"/>
       </w:pPr>
       <w:r>
         <w:rPr>
           <w:sz w:val="22"/>
         </w:rPr>
-        <w:t>Serial output:  Raw: 3741   V_ADC: 3.014 V   V_BATT: 24.01 V   (every 500 ms)</w:t>
+        <w:t>VBATT_RAW_FLOOR = 250  →  raw ≤ 250 is treated as no battery connected → reports 0.00 V</w:t>
+      </w:r>
+    </w:p>
+    <w:p>
+      <w:pPr>
+        <w:pStyle w:val="ListBullet"/>
+        <w:spacing w:before="20" w:after="20"/>
+        <w:ind w:left="360"/>
+      </w:pPr>
+      <w:r>
+        <w:rPr>
+          <w:sz w:val="22"/>
+        </w:rPr>
+        <w:t>Anchored on the widest available voltage separation (5 V / 24 V) for best accuracy — validated against 10 V and 20 V measurements, both within ±0.02 V of actual.</w:t>
+      </w:r>
+    </w:p>
+    <w:p>
+      <w:pPr>
+        <w:pStyle w:val="ListBullet"/>
+        <w:spacing w:before="20" w:after="20"/>
+        <w:ind w:left="360"/>
+      </w:pPr>
+      <w:r>
+        <w:rPr>
+          <w:sz w:val="22"/>
+        </w:rPr>
+        <w:t>Serial output:  Raw: 3608   V_ADC: 2.907 V   V_BATT: 24.00 V   (every ~756 ms)</w:t>
       </w:r>
     </w:p>
     <w:p>
@@ -3416,7 +3442,7 @@
         <w:rPr>
           <w:sz w:val="22"/>
         </w:rPr>
-        <w:t>Live gauges: THROTTLE arc gauge (0–100 %), TACHOMETER arc gauge (0–50 000 RPM placeholder),</w:t>
+        <w:t>Live gauges: THROTTLE, TACHOMETER (0–50 000 RPM placeholder) and BATTERY VOLTAGE (0–30 V) as 290 px needle dials, plus TC1 / TC2 / MCU vertical thermometer gauges.</w:t>
       </w:r>
     </w:p>
     <w:p>
@@ -3429,7 +3455,33 @@
         <w:rPr>
           <w:sz w:val="22"/>
         </w:rPr>
-        <w:t>battery circular gauge (0–30 V), TC1 / TC2 / MCU vertical thermometer gauges.</w:t>
+        <w:t>Each needle dial shows a digital value readout directly on the dial face, in the blank 90° wedge below the pivot where the sweep and tick labels leave genuinely empty space — avoids the value overlapping the needle at the center, and needs no separate box or border.</w:t>
+      </w:r>
+    </w:p>
+    <w:p>
+      <w:pPr>
+        <w:pStyle w:val="ListBullet"/>
+        <w:spacing w:before="20" w:after="20"/>
+        <w:ind w:left="360"/>
+      </w:pPr>
+      <w:r>
+        <w:rPr>
+          <w:sz w:val="22"/>
+        </w:rPr>
+        <w:t>Emergency Stop button (top-right of the connection bar) — forces all 6 FETs LOW immediately, independent of the ALL LOW button in the FET panel, always visible regardless of scroll position.</w:t>
+      </w:r>
+    </w:p>
+    <w:p>
+      <w:pPr>
+        <w:pStyle w:val="ListBullet"/>
+        <w:spacing w:before="20" w:after="20"/>
+        <w:ind w:left="360"/>
+      </w:pPr>
+      <w:r>
+        <w:rPr>
+          <w:sz w:val="22"/>
+        </w:rPr>
+        <w:t>USB-TTL disconnect detection — if the serial adapter is physically removed while connected, the reader thread detects the read failure and automatically resets the GUI to DISCONNECTED (status, button, all gauges, all FET states) instead of freezing on stale data.</w:t>
       </w:r>
     </w:p>
     <w:p>
@@ -3520,7 +3572,7 @@
         <w:rPr>
           <w:sz w:val="22"/>
         </w:rPr>
-        <w:t>All displays reset to zero on disconnect.</w:t>
+        <w:t>All displays reset to zero on disconnect (manual or automatic).</w:t>
       </w:r>
     </w:p>
     <w:p>
@@ -4286,7 +4338,7 @@
           <w:i w:val="0"/>
           <w:sz w:val="22"/>
         </w:rPr>
-        <w:t>Performed once per board. Requires a known-accurate bench supply or multimeter.</w:t>
+        <w:t>Required whenever the supply/ground path changes (e.g. switching between powering the board from USB vs. from the battery/supply directly) — the raw ADC baseline shifts with the ground reference even though the underlying voltage-to-raw-count slope stays the same. Requires a known-accurate bench supply or multimeter.</w:t>
       </w:r>
     </w:p>
     <w:p>
@@ -4299,7 +4351,7 @@
         <w:rPr>
           <w:sz w:val="22"/>
         </w:rPr>
-        <w:t>Step 1: Apply 0 V to the battery input terminal. Wait for the "Raw:" readings to settle.</w:t>
+        <w:t>Step 1: Power the board exactly as it will be used during testing (this affects the ground reference).</w:t>
       </w:r>
     </w:p>
     <w:p>
@@ -4312,7 +4364,7 @@
         <w:rPr>
           <w:sz w:val="22"/>
         </w:rPr>
-        <w:t>Step 2: Note the highest "Raw: xxxx" value seen on the serial log. Add 5 to it.</w:t>
+        <w:t>Step 2: Apply a known low voltage (e.g. 5.00 V) to the battery input. Note the "Raw: xxxx" value → LO point.</w:t>
       </w:r>
     </w:p>
     <w:p>
@@ -4325,7 +4377,7 @@
         <w:rPr>
           <w:sz w:val="22"/>
         </w:rPr>
-        <w:t>Step 3: Set VBATT_RAW_ZERO in firmware to this value.</w:t>
+        <w:t>Step 3: Apply a known high voltage (e.g. 24.00 V). Note the "Raw: xxxx" value → HI point.</w:t>
       </w:r>
     </w:p>
     <w:p>
@@ -4338,7 +4390,7 @@
         <w:rPr>
           <w:sz w:val="22"/>
         </w:rPr>
-        <w:t>Step 4: Apply a known accurate voltage (e.g. 24.00 V from a calibrated bench supply).</w:t>
+        <w:t>Step 4:    Use the widest voltage separation available — it minimizes calibration error.</w:t>
       </w:r>
     </w:p>
     <w:p>
@@ -4351,7 +4403,7 @@
         <w:rPr>
           <w:sz w:val="22"/>
         </w:rPr>
-        <w:t>Step 5: Note the "Raw: xxxx" value at this voltage.</w:t>
+        <w:t>Step 5: Set VBATT_RAW_LO / VBATT_MV_LO and VBATT_RAW_HI / VBATT_MV_HI from those two readings.</w:t>
       </w:r>
     </w:p>
     <w:p>
@@ -4364,20 +4416,21 @@
         <w:rPr>
           <w:sz w:val="22"/>
         </w:rPr>
-        <w:t>Step 6: Set VBATT_RAW_CAL to this raw value and VBATT_MV_CAL to the supply voltage in millivolts.</w:t>
+        <w:t>Step 6: Rebuild and flash. Cross-check against one or two intermediate voltages to confirm accuracy.</w:t>
       </w:r>
     </w:p>
     <w:p>
       <w:pPr>
-        <w:pStyle w:val="ListBullet"/>
-        <w:spacing w:before="20" w:after="20"/>
-        <w:ind w:left="360"/>
+        <w:spacing w:before="40" w:after="40"/>
       </w:pPr>
       <w:r>
         <w:rPr>
+          <w:b w:val="0"/>
+          <w:i/>
+          <w:color w:val="777777"/>
           <w:sz w:val="22"/>
         </w:rPr>
-        <w:t>Step 7: Rebuild and flash the firmware. Voltage should now read correctly at both calibration points.</w:t>
+        <w:t>Board measurements (2026-07-01, direct-supply powered): 5.00 V → Raw 678, 10.00 V → Raw 1447, 20.00 V → Raw 2993, 24.00 V → Raw 3608. Anchored on the 5 V/24 V pair; the 10 V and 20 V points both validated within ±0.02 V of actual.</w:t>
       </w:r>
     </w:p>
     <w:p>
@@ -4835,6 +4888,108 @@
     </w:p>
     <w:p>
       <w:pPr>
+        <w:spacing w:before="200" w:after="40"/>
+      </w:pPr>
+      <w:r>
+        <w:rPr>
+          <w:b/>
+          <w:color w:val="007A87"/>
+          <w:sz w:val="26"/>
+        </w:rPr>
+        <w:t>Issue: Battery voltage showing a constant ~1.6 V offset after switching to direct-supply power (24.00 V actual read as 22.40 V; 20.00 V actual read as 18.40 V — same absolute gap at both points, confirming an offset, not a gain error)</w:t>
+      </w:r>
+    </w:p>
+    <w:p>
+      <w:pPr>
+        <w:spacing w:before="40" w:after="20"/>
+      </w:pPr>
+      <w:r>
+        <w:rPr>
+          <w:b/>
+          <w:color w:val="D96500"/>
+          <w:sz w:val="22"/>
+        </w:rPr>
+        <w:t xml:space="preserve">Root Cause: </w:t>
+      </w:r>
+      <w:r>
+        <w:rPr>
+          <w:sz w:val="22"/>
+        </w:rPr>
+        <w:t>The old VBATT_RAW_ZERO/VBATT_RAW_CAL constants were calibrated while the board was powered via USB. Powering the Blue Pill directly from the battery/supply instead changed the ADC sense line’s ground reference, shifting the raw ADC baseline for every voltage by a constant amount — the "0 V anchor" the old formula relied on no longer matched reality.</w:t>
+      </w:r>
+    </w:p>
+    <w:p>
+      <w:pPr>
+        <w:spacing w:before="20" w:after="120"/>
+      </w:pPr>
+      <w:r>
+        <w:rPr>
+          <w:b/>
+          <w:color w:val="1E7E34"/>
+          <w:sz w:val="22"/>
+        </w:rPr>
+        <w:t xml:space="preserve">Resolution: </w:t>
+      </w:r>
+      <w:r>
+        <w:rPr>
+          <w:sz w:val="22"/>
+        </w:rPr>
+        <w:t>Replaced the zero-anchored formula with a direct two-point linear interpolation between two real, non-extrapolated measurements (5.00 V → Raw 678, 24.00 V → Raw 3608), which is immune to this kind of ground-reference shift since it does not assume any particular raw value corresponds to exactly 0 V. Validated against 10 V/20 V measurements — both within ±0.02 V of actual.</w:t>
+      </w:r>
+    </w:p>
+    <w:p>
+      <w:pPr>
+        <w:spacing w:before="200" w:after="40"/>
+      </w:pPr>
+      <w:r>
+        <w:rPr>
+          <w:b/>
+          <w:color w:val="007A87"/>
+          <w:sz w:val="26"/>
+        </w:rPr>
+        <w:t>Issue: Residual ~0.10 V report-to-report fluctuation in V_BATT even after correct calibration</w:t>
+      </w:r>
+    </w:p>
+    <w:p>
+      <w:pPr>
+        <w:spacing w:before="40" w:after="20"/>
+      </w:pPr>
+      <w:r>
+        <w:rPr>
+          <w:b/>
+          <w:color w:val="D96500"/>
+          <w:sz w:val="22"/>
+        </w:rPr>
+        <w:t xml:space="preserve">Root Cause: </w:t>
+      </w:r>
+      <w:r>
+        <w:rPr>
+          <w:sz w:val="22"/>
+        </w:rPr>
+        <w:t>The 64-sample block average still let through some ADC/supply noise between reports; a first attempt at fixing it with a 10-report moving average smoothed the display but made it react to genuine voltage changes ~5.6 s slower — rejected as unacceptable lag.</w:t>
+      </w:r>
+    </w:p>
+    <w:p>
+      <w:pPr>
+        <w:spacing w:before="20" w:after="120"/>
+      </w:pPr>
+      <w:r>
+        <w:rPr>
+          <w:b/>
+          <w:color w:val="1E7E34"/>
+          <w:sz w:val="22"/>
+        </w:rPr>
+        <w:t xml:space="preserve">Resolution: </w:t>
+      </w:r>
+      <w:r>
+        <w:rPr>
+          <w:sz w:val="22"/>
+        </w:rPr>
+        <w:t>Increased the per-report oversampling window from 64 to 256 samples instead. This halves jitter via the same block average (√(256/64) ≈ 2×) but carries no memory between reports, so a real voltage change still shows up on the very next report — no added lag, unlike the moving-average approach.</w:t>
+      </w:r>
+    </w:p>
+    <w:p>
+      <w:pPr>
         <w:spacing w:before="280" w:after="80"/>
         <w:pBdr>
           <w:bottom w:val="single" w:sz="8" w:space="4" w:color="1A376C"/>
@@ -4872,7 +5027,7 @@
           <w:color w:val="1E7E34"/>
           <w:sz w:val="22"/>
         </w:rPr>
-        <w:t>✓  Battery voltage — 64-sample averaged, two-point raw-count calibrated, accurate to ±0.05 V</w:t>
+        <w:t>✓  Battery voltage — 256-sample averaged, two-point linear calibration (5V/24V anchors), accurate to ±0.02 V</w:t>
       </w:r>
     </w:p>
     <w:p>
@@ -4924,7 +5079,7 @@
           <w:color w:val="1E7E34"/>
           <w:sz w:val="22"/>
         </w:rPr>
-        <w:t>✓  MCU die temperature — internal ADC channel, reported every 1000 ms</w:t>
+        <w:t>✓  MCU die temperature — internal ADC channel, reported every ~1512 ms</w:t>
       </w:r>
     </w:p>
     <w:p>
@@ -4976,7 +5131,7 @@
           <w:color w:val="1E7E34"/>
           <w:sz w:val="22"/>
         </w:rPr>
-        <w:t>✓  PC Python GUI — live gauges, 2×4 FET panel, RC calibration wizard, serial log</w:t>
+        <w:t>✓  PC Python GUI — live gauges with in-dial digital readout, Emergency Stop, USB-TTL disconnect detection, 2×4 FET panel, RC calibration wizard, serial log</w:t>
       </w:r>
     </w:p>
     <w:p>
@@ -5023,13 +5178,13 @@
           <w:color w:val="D96500"/>
           <w:sz w:val="22"/>
         </w:rPr>
-        <w:t xml:space="preserve">○  Battery voltage fine-tuning — </w:t>
+        <w:t xml:space="preserve">○  Battery voltage — hardware-level ripple — </w:t>
       </w:r>
       <w:r>
         <w:rPr>
           <w:sz w:val="22"/>
         </w:rPr>
-        <w:t>VBATT_RAW_CAL was set from estimated measurements. For maximum accuracy: connect a verified 24.00 V reference, observe Raw: value, update VBATT_RAW_CAL, and reflash the firmware.</w:t>
+        <w:t>If jitter is still noticeable after the 256-sample software averaging, the remaining cause is likely real analog ripple/noise on the PA1 sense line rather than something software averaging alone can remove. A small filter capacitor (100 nF–1 µF) from PA1 to GND would filter it at the source.</w:t>
       </w:r>
     </w:p>
     <w:p>
@@ -5483,7 +5638,7 @@
               <w:rPr>
                 <w:sz w:val="20"/>
               </w:rPr>
-              <w:t>VBATT_RAW_ZERO</w:t>
+              <w:t>VBATT_RAW_LO / VBATT_MV_LO</w:t>
             </w:r>
           </w:p>
         </w:tc>
@@ -5498,7 +5653,7 @@
               <w:rPr>
                 <w:sz w:val="20"/>
               </w:rPr>
-              <w:t>190</w:t>
+              <w:t>678 / 5000 mV</w:t>
             </w:r>
           </w:p>
         </w:tc>
@@ -5513,7 +5668,7 @@
               <w:rPr>
                 <w:sz w:val="20"/>
               </w:rPr>
-              <w:t>Raw ADC count at 0 V battery input (noise floor clamp)</w:t>
+              <w:t>Low calibration anchor (measured, direct-supply powered)</w:t>
             </w:r>
           </w:p>
         </w:tc>
@@ -5530,7 +5685,7 @@
               <w:rPr>
                 <w:sz w:val="20"/>
               </w:rPr>
-              <w:t>VBATT_RAW_CAL</w:t>
+              <w:t>VBATT_RAW_HI / VBATT_MV_HI</w:t>
             </w:r>
           </w:p>
         </w:tc>
@@ -5545,7 +5700,7 @@
               <w:rPr>
                 <w:sz w:val="20"/>
               </w:rPr>
-              <w:t>3923</w:t>
+              <w:t>3608 / 24000 mV</w:t>
             </w:r>
           </w:p>
         </w:tc>
@@ -5560,7 +5715,7 @@
               <w:rPr>
                 <w:sz w:val="20"/>
               </w:rPr>
-              <w:t>Raw ADC count at the 24 V calibration reference</w:t>
+              <w:t>High calibration anchor (measured, direct-supply powered)</w:t>
             </w:r>
           </w:p>
         </w:tc>
@@ -5577,7 +5732,7 @@
               <w:rPr>
                 <w:sz w:val="20"/>
               </w:rPr>
-              <w:t>VBATT_MV_CAL</w:t>
+              <w:t>VBATT_RAW_FLOOR</w:t>
             </w:r>
           </w:p>
         </w:tc>
@@ -5592,7 +5747,7 @@
               <w:rPr>
                 <w:sz w:val="20"/>
               </w:rPr>
-              <w:t>24000 mV</w:t>
+              <w:t>250</w:t>
             </w:r>
           </w:p>
         </w:tc>
@@ -5607,7 +5762,7 @@
               <w:rPr>
                 <w:sz w:val="20"/>
               </w:rPr>
-              <w:t>Known accurate voltage at VBATT_RAW_CAL calibration point</w:t>
+              <w:t>Raw ADC count at/below which output clamps to 0.00 V (no battery)</w:t>
             </w:r>
           </w:p>
         </w:tc>
@@ -5733,7 +5888,7 @@
               <w:rPr>
                 <w:sz w:val="20"/>
               </w:rPr>
-              <w:t>64 samples × 1 ms</w:t>
+              <w:t>256 samples × 1 ms</w:t>
             </w:r>
           </w:p>
         </w:tc>
@@ -5748,7 +5903,7 @@
               <w:rPr>
                 <w:sz w:val="20"/>
               </w:rPr>
-              <w:t>Total settling time ~64 ms per voltage reading</w:t>
+              <w:t>Total settling time ~256 ms per voltage reading</w:t>
             </w:r>
           </w:p>
         </w:tc>

</xml_diff>

<commit_message>
Add ESC PWM output, restructure GUI layout, update battery calibration and docs
</commit_message>
<xml_diff>
--- a/JET ECU Firmware/JET_ECU_Project_Documentation.docx
+++ b/JET ECU Firmware/JET_ECU_Project_Documentation.docx
@@ -43,7 +43,7 @@
           <w:color w:val="555555"/>
           <w:sz w:val="22"/>
         </w:rPr>
-        <w:t>Date: July 01, 2026</w:t>
+        <w:t>Date: July 02, 2026</w:t>
       </w:r>
     </w:p>
     <w:p>
@@ -1282,7 +1282,7 @@
               <w:rPr>
                 <w:sz w:val="20"/>
               </w:rPr>
-              <w:t>PA6</w:t>
+              <w:t>PA10</w:t>
             </w:r>
           </w:p>
         </w:tc>
@@ -1297,6 +1297,53 @@
               <w:rPr>
                 <w:sz w:val="20"/>
               </w:rPr>
+              <w:t>ESC PWM Output</w:t>
+            </w:r>
+          </w:p>
+        </w:tc>
+        <w:tc>
+          <w:tcPr>
+            <w:tcW w:type="dxa" w:w="6066"/>
+            <w:shd w:val="clear" w:color="auto" w:fill="FFFFFF"/>
+            <w:vAlign w:val="center"/>
+          </w:tcPr>
+          <w:p>
+            <w:r>
+              <w:rPr>
+                <w:sz w:val="20"/>
+              </w:rPr>
+              <w:t>TIM1_CH3, 1000–2000 µs pulse @ 50 Hz, mapped 1:1 from RC throttle %</w:t>
+            </w:r>
+          </w:p>
+        </w:tc>
+      </w:tr>
+      <w:tr>
+        <w:tc>
+          <w:tcPr>
+            <w:tcW w:type="dxa" w:w="1020"/>
+            <w:shd w:val="clear" w:color="auto" w:fill="F2F2F2"/>
+            <w:vAlign w:val="center"/>
+          </w:tcPr>
+          <w:p>
+            <w:r>
+              <w:rPr>
+                <w:sz w:val="20"/>
+              </w:rPr>
+              <w:t>PA6</w:t>
+            </w:r>
+          </w:p>
+        </w:tc>
+        <w:tc>
+          <w:tcPr>
+            <w:tcW w:type="dxa" w:w="1984"/>
+            <w:shd w:val="clear" w:color="auto" w:fill="F2F2F2"/>
+            <w:vAlign w:val="center"/>
+          </w:tcPr>
+          <w:p>
+            <w:r>
+              <w:rPr>
+                <w:sz w:val="20"/>
+              </w:rPr>
               <w:t>TC1 SO</w:t>
             </w:r>
           </w:p>
@@ -1304,7 +1351,7 @@
         <w:tc>
           <w:tcPr>
             <w:tcW w:type="dxa" w:w="6066"/>
-            <w:shd w:val="clear" w:color="auto" w:fill="FFFFFF"/>
+            <w:shd w:val="clear" w:color="auto" w:fill="F2F2F2"/>
             <w:vAlign w:val="center"/>
           </w:tcPr>
           <w:p>
@@ -1321,7 +1368,7 @@
         <w:tc>
           <w:tcPr>
             <w:tcW w:type="dxa" w:w="1020"/>
-            <w:shd w:val="clear" w:color="auto" w:fill="F2F2F2"/>
+            <w:shd w:val="clear" w:color="auto" w:fill="FFFFFF"/>
             <w:vAlign w:val="center"/>
           </w:tcPr>
           <w:p>
@@ -1336,7 +1383,7 @@
         <w:tc>
           <w:tcPr>
             <w:tcW w:type="dxa" w:w="1984"/>
-            <w:shd w:val="clear" w:color="auto" w:fill="F2F2F2"/>
+            <w:shd w:val="clear" w:color="auto" w:fill="FFFFFF"/>
             <w:vAlign w:val="center"/>
           </w:tcPr>
           <w:p>
@@ -1351,7 +1398,7 @@
         <w:tc>
           <w:tcPr>
             <w:tcW w:type="dxa" w:w="6066"/>
-            <w:shd w:val="clear" w:color="auto" w:fill="F2F2F2"/>
+            <w:shd w:val="clear" w:color="auto" w:fill="FFFFFF"/>
             <w:vAlign w:val="center"/>
           </w:tcPr>
           <w:p>
@@ -1368,7 +1415,7 @@
         <w:tc>
           <w:tcPr>
             <w:tcW w:type="dxa" w:w="1020"/>
-            <w:shd w:val="clear" w:color="auto" w:fill="FFFFFF"/>
+            <w:shd w:val="clear" w:color="auto" w:fill="F2F2F2"/>
             <w:vAlign w:val="center"/>
           </w:tcPr>
           <w:p>
@@ -1383,7 +1430,7 @@
         <w:tc>
           <w:tcPr>
             <w:tcW w:type="dxa" w:w="1984"/>
-            <w:shd w:val="clear" w:color="auto" w:fill="FFFFFF"/>
+            <w:shd w:val="clear" w:color="auto" w:fill="F2F2F2"/>
             <w:vAlign w:val="center"/>
           </w:tcPr>
           <w:p>
@@ -1398,7 +1445,7 @@
         <w:tc>
           <w:tcPr>
             <w:tcW w:type="dxa" w:w="6066"/>
-            <w:shd w:val="clear" w:color="auto" w:fill="FFFFFF"/>
+            <w:shd w:val="clear" w:color="auto" w:fill="F2F2F2"/>
             <w:vAlign w:val="center"/>
           </w:tcPr>
           <w:p>
@@ -1415,7 +1462,7 @@
         <w:tc>
           <w:tcPr>
             <w:tcW w:type="dxa" w:w="1020"/>
-            <w:shd w:val="clear" w:color="auto" w:fill="F2F2F2"/>
+            <w:shd w:val="clear" w:color="auto" w:fill="FFFFFF"/>
             <w:vAlign w:val="center"/>
           </w:tcPr>
           <w:p>
@@ -1430,7 +1477,7 @@
         <w:tc>
           <w:tcPr>
             <w:tcW w:type="dxa" w:w="1984"/>
-            <w:shd w:val="clear" w:color="auto" w:fill="F2F2F2"/>
+            <w:shd w:val="clear" w:color="auto" w:fill="FFFFFF"/>
             <w:vAlign w:val="center"/>
           </w:tcPr>
           <w:p>
@@ -1445,7 +1492,7 @@
         <w:tc>
           <w:tcPr>
             <w:tcW w:type="dxa" w:w="6066"/>
-            <w:shd w:val="clear" w:color="auto" w:fill="F2F2F2"/>
+            <w:shd w:val="clear" w:color="auto" w:fill="FFFFFF"/>
             <w:vAlign w:val="center"/>
           </w:tcPr>
           <w:p>
@@ -1462,7 +1509,7 @@
         <w:tc>
           <w:tcPr>
             <w:tcW w:type="dxa" w:w="1020"/>
-            <w:shd w:val="clear" w:color="auto" w:fill="FFFFFF"/>
+            <w:shd w:val="clear" w:color="auto" w:fill="F2F2F2"/>
             <w:vAlign w:val="center"/>
           </w:tcPr>
           <w:p>
@@ -1477,7 +1524,7 @@
         <w:tc>
           <w:tcPr>
             <w:tcW w:type="dxa" w:w="1984"/>
-            <w:shd w:val="clear" w:color="auto" w:fill="FFFFFF"/>
+            <w:shd w:val="clear" w:color="auto" w:fill="F2F2F2"/>
             <w:vAlign w:val="center"/>
           </w:tcPr>
           <w:p>
@@ -1492,7 +1539,7 @@
         <w:tc>
           <w:tcPr>
             <w:tcW w:type="dxa" w:w="6066"/>
-            <w:shd w:val="clear" w:color="auto" w:fill="FFFFFF"/>
+            <w:shd w:val="clear" w:color="auto" w:fill="F2F2F2"/>
             <w:vAlign w:val="center"/>
           </w:tcPr>
           <w:p>
@@ -1509,7 +1556,7 @@
         <w:tc>
           <w:tcPr>
             <w:tcW w:type="dxa" w:w="1020"/>
-            <w:shd w:val="clear" w:color="auto" w:fill="F2F2F2"/>
+            <w:shd w:val="clear" w:color="auto" w:fill="FFFFFF"/>
             <w:vAlign w:val="center"/>
           </w:tcPr>
           <w:p>
@@ -1524,7 +1571,7 @@
         <w:tc>
           <w:tcPr>
             <w:tcW w:type="dxa" w:w="1984"/>
-            <w:shd w:val="clear" w:color="auto" w:fill="F2F2F2"/>
+            <w:shd w:val="clear" w:color="auto" w:fill="FFFFFF"/>
             <w:vAlign w:val="center"/>
           </w:tcPr>
           <w:p>
@@ -1539,7 +1586,7 @@
         <w:tc>
           <w:tcPr>
             <w:tcW w:type="dxa" w:w="6066"/>
-            <w:shd w:val="clear" w:color="auto" w:fill="F2F2F2"/>
+            <w:shd w:val="clear" w:color="auto" w:fill="FFFFFF"/>
             <w:vAlign w:val="center"/>
           </w:tcPr>
           <w:p>
@@ -1556,7 +1603,7 @@
         <w:tc>
           <w:tcPr>
             <w:tcW w:type="dxa" w:w="1020"/>
-            <w:shd w:val="clear" w:color="auto" w:fill="FFFFFF"/>
+            <w:shd w:val="clear" w:color="auto" w:fill="F2F2F2"/>
             <w:vAlign w:val="center"/>
           </w:tcPr>
           <w:p>
@@ -1571,7 +1618,7 @@
         <w:tc>
           <w:tcPr>
             <w:tcW w:type="dxa" w:w="1984"/>
-            <w:shd w:val="clear" w:color="auto" w:fill="FFFFFF"/>
+            <w:shd w:val="clear" w:color="auto" w:fill="F2F2F2"/>
             <w:vAlign w:val="center"/>
           </w:tcPr>
           <w:p>
@@ -1586,7 +1633,7 @@
         <w:tc>
           <w:tcPr>
             <w:tcW w:type="dxa" w:w="6066"/>
-            <w:shd w:val="clear" w:color="auto" w:fill="FFFFFF"/>
+            <w:shd w:val="clear" w:color="auto" w:fill="F2F2F2"/>
             <w:vAlign w:val="center"/>
           </w:tcPr>
           <w:p>
@@ -1603,7 +1650,7 @@
         <w:tc>
           <w:tcPr>
             <w:tcW w:type="dxa" w:w="1020"/>
-            <w:shd w:val="clear" w:color="auto" w:fill="F2F2F2"/>
+            <w:shd w:val="clear" w:color="auto" w:fill="FFFFFF"/>
             <w:vAlign w:val="center"/>
           </w:tcPr>
           <w:p>
@@ -1618,7 +1665,7 @@
         <w:tc>
           <w:tcPr>
             <w:tcW w:type="dxa" w:w="1984"/>
-            <w:shd w:val="clear" w:color="auto" w:fill="F2F2F2"/>
+            <w:shd w:val="clear" w:color="auto" w:fill="FFFFFF"/>
             <w:vAlign w:val="center"/>
           </w:tcPr>
           <w:p>
@@ -1633,7 +1680,7 @@
         <w:tc>
           <w:tcPr>
             <w:tcW w:type="dxa" w:w="6066"/>
-            <w:shd w:val="clear" w:color="auto" w:fill="F2F2F2"/>
+            <w:shd w:val="clear" w:color="auto" w:fill="FFFFFF"/>
             <w:vAlign w:val="center"/>
           </w:tcPr>
           <w:p>
@@ -1650,7 +1697,7 @@
         <w:tc>
           <w:tcPr>
             <w:tcW w:type="dxa" w:w="1020"/>
-            <w:shd w:val="clear" w:color="auto" w:fill="FFFFFF"/>
+            <w:shd w:val="clear" w:color="auto" w:fill="F2F2F2"/>
             <w:vAlign w:val="center"/>
           </w:tcPr>
           <w:p>
@@ -1665,7 +1712,7 @@
         <w:tc>
           <w:tcPr>
             <w:tcW w:type="dxa" w:w="1984"/>
-            <w:shd w:val="clear" w:color="auto" w:fill="FFFFFF"/>
+            <w:shd w:val="clear" w:color="auto" w:fill="F2F2F2"/>
             <w:vAlign w:val="center"/>
           </w:tcPr>
           <w:p>
@@ -1680,7 +1727,7 @@
         <w:tc>
           <w:tcPr>
             <w:tcW w:type="dxa" w:w="6066"/>
-            <w:shd w:val="clear" w:color="auto" w:fill="FFFFFF"/>
+            <w:shd w:val="clear" w:color="auto" w:fill="F2F2F2"/>
             <w:vAlign w:val="center"/>
           </w:tcPr>
           <w:p>
@@ -1697,7 +1744,7 @@
         <w:tc>
           <w:tcPr>
             <w:tcW w:type="dxa" w:w="1020"/>
-            <w:shd w:val="clear" w:color="auto" w:fill="F2F2F2"/>
+            <w:shd w:val="clear" w:color="auto" w:fill="FFFFFF"/>
             <w:vAlign w:val="center"/>
           </w:tcPr>
           <w:p>
@@ -1712,7 +1759,7 @@
         <w:tc>
           <w:tcPr>
             <w:tcW w:type="dxa" w:w="1984"/>
-            <w:shd w:val="clear" w:color="auto" w:fill="F2F2F2"/>
+            <w:shd w:val="clear" w:color="auto" w:fill="FFFFFF"/>
             <w:vAlign w:val="center"/>
           </w:tcPr>
           <w:p>
@@ -1727,7 +1774,7 @@
         <w:tc>
           <w:tcPr>
             <w:tcW w:type="dxa" w:w="6066"/>
-            <w:shd w:val="clear" w:color="auto" w:fill="F2F2F2"/>
+            <w:shd w:val="clear" w:color="auto" w:fill="FFFFFF"/>
             <w:vAlign w:val="center"/>
           </w:tcPr>
           <w:p>
@@ -1744,7 +1791,7 @@
         <w:tc>
           <w:tcPr>
             <w:tcW w:type="dxa" w:w="1020"/>
-            <w:shd w:val="clear" w:color="auto" w:fill="FFFFFF"/>
+            <w:shd w:val="clear" w:color="auto" w:fill="F2F2F2"/>
             <w:vAlign w:val="center"/>
           </w:tcPr>
           <w:p>
@@ -1759,7 +1806,7 @@
         <w:tc>
           <w:tcPr>
             <w:tcW w:type="dxa" w:w="1984"/>
-            <w:shd w:val="clear" w:color="auto" w:fill="FFFFFF"/>
+            <w:shd w:val="clear" w:color="auto" w:fill="F2F2F2"/>
             <w:vAlign w:val="center"/>
           </w:tcPr>
           <w:p>
@@ -1774,7 +1821,7 @@
         <w:tc>
           <w:tcPr>
             <w:tcW w:type="dxa" w:w="6066"/>
-            <w:shd w:val="clear" w:color="auto" w:fill="FFFFFF"/>
+            <w:shd w:val="clear" w:color="auto" w:fill="F2F2F2"/>
             <w:vAlign w:val="center"/>
           </w:tcPr>
           <w:p>
@@ -1791,7 +1838,7 @@
         <w:tc>
           <w:tcPr>
             <w:tcW w:type="dxa" w:w="1020"/>
-            <w:shd w:val="clear" w:color="auto" w:fill="F2F2F2"/>
+            <w:shd w:val="clear" w:color="auto" w:fill="FFFFFF"/>
             <w:vAlign w:val="center"/>
           </w:tcPr>
           <w:p>
@@ -1806,7 +1853,7 @@
         <w:tc>
           <w:tcPr>
             <w:tcW w:type="dxa" w:w="1984"/>
-            <w:shd w:val="clear" w:color="auto" w:fill="F2F2F2"/>
+            <w:shd w:val="clear" w:color="auto" w:fill="FFFFFF"/>
             <w:vAlign w:val="center"/>
           </w:tcPr>
           <w:p>
@@ -1821,7 +1868,7 @@
         <w:tc>
           <w:tcPr>
             <w:tcW w:type="dxa" w:w="6066"/>
-            <w:shd w:val="clear" w:color="auto" w:fill="F2F2F2"/>
+            <w:shd w:val="clear" w:color="auto" w:fill="FFFFFF"/>
             <w:vAlign w:val="center"/>
           </w:tcPr>
           <w:p>
@@ -1838,7 +1885,7 @@
         <w:tc>
           <w:tcPr>
             <w:tcW w:type="dxa" w:w="1020"/>
-            <w:shd w:val="clear" w:color="auto" w:fill="FFFFFF"/>
+            <w:shd w:val="clear" w:color="auto" w:fill="F2F2F2"/>
             <w:vAlign w:val="center"/>
           </w:tcPr>
           <w:p>
@@ -1853,7 +1900,7 @@
         <w:tc>
           <w:tcPr>
             <w:tcW w:type="dxa" w:w="1984"/>
-            <w:shd w:val="clear" w:color="auto" w:fill="FFFFFF"/>
+            <w:shd w:val="clear" w:color="auto" w:fill="F2F2F2"/>
             <w:vAlign w:val="center"/>
           </w:tcPr>
           <w:p>
@@ -1868,7 +1915,7 @@
         <w:tc>
           <w:tcPr>
             <w:tcW w:type="dxa" w:w="6066"/>
-            <w:shd w:val="clear" w:color="auto" w:fill="FFFFFF"/>
+            <w:shd w:val="clear" w:color="auto" w:fill="F2F2F2"/>
             <w:vAlign w:val="center"/>
           </w:tcPr>
           <w:p>
@@ -2077,7 +2124,7 @@
               <w:rPr>
                 <w:sz w:val="20"/>
               </w:rPr>
-              <w:t>Reads RC PWM via GPIO polling (pulseIn_us), applies spike filter and hold-last-valid logic, maps to 0–100 % throttle, sends THR: output.</w:t>
+              <w:t>Reads RC PWM via GPIO polling (pulseIn_us), applies spike filter and hold-last-valid logic, maps to 0–100 % throttle, drives the ESC PWM output (TIM1_CH3), sends THR: and PWM: output.</w:t>
             </w:r>
           </w:p>
         </w:tc>
@@ -2686,6 +2733,53 @@
           </w:p>
         </w:tc>
       </w:tr>
+      <w:tr>
+        <w:tc>
+          <w:tcPr>
+            <w:tcW w:type="dxa" w:w="2268"/>
+            <w:shd w:val="clear" w:color="auto" w:fill="FFFFFF"/>
+            <w:vAlign w:val="center"/>
+          </w:tcPr>
+          <w:p>
+            <w:r>
+              <w:rPr>
+                <w:sz w:val="20"/>
+              </w:rPr>
+              <w:t>TIM1 (ESC PWM)</w:t>
+            </w:r>
+          </w:p>
+        </w:tc>
+        <w:tc>
+          <w:tcPr>
+            <w:tcW w:type="dxa" w:w="2268"/>
+            <w:shd w:val="clear" w:color="auto" w:fill="FFFFFF"/>
+            <w:vAlign w:val="center"/>
+          </w:tcPr>
+          <w:p>
+            <w:r>
+              <w:rPr>
+                <w:sz w:val="20"/>
+              </w:rPr>
+              <w:t>PSC=63, ARR=19999</w:t>
+            </w:r>
+          </w:p>
+        </w:tc>
+        <w:tc>
+          <w:tcPr>
+            <w:tcW w:type="dxa" w:w="4535"/>
+            <w:shd w:val="clear" w:color="auto" w:fill="FFFFFF"/>
+            <w:vAlign w:val="center"/>
+          </w:tcPr>
+          <w:p>
+            <w:r>
+              <w:rPr>
+                <w:sz w:val="20"/>
+              </w:rPr>
+              <w:t>1 MHz counter, 20 ms/50 Hz period; CCR value in µs directly matches RC/ESC pulse convention</w:t>
+            </w:r>
+          </w:p>
+        </w:tc>
+      </w:tr>
     </w:tbl>
     <w:p/>
     <w:p>
@@ -2779,7 +2873,7 @@
         <w:rPr>
           <w:sz w:val="22"/>
         </w:rPr>
-        <w:t>VBATT_RAW_LO = 678 at VBATT_MV_LO = 5000 mV   (low anchor point)</w:t>
+        <w:t>VBATT_RAW_LO = 770 at VBATT_MV_LO = 5000 mV   (low anchor point)</w:t>
       </w:r>
     </w:p>
     <w:p>
@@ -2792,7 +2886,7 @@
         <w:rPr>
           <w:sz w:val="22"/>
         </w:rPr>
-        <w:t>VBATT_RAW_HI = 3608 at VBATT_MV_HI = 24000 mV  (high anchor point)</w:t>
+        <w:t>VBATT_RAW_HI = 3710 at VBATT_MV_HI = 24000 mV  (high anchor point)</w:t>
       </w:r>
     </w:p>
     <w:p>
@@ -3104,7 +3198,98 @@
           <w:color w:val="007A87"/>
           <w:sz w:val="26"/>
         </w:rPr>
-        <w:t>5.3  FET Outputs</w:t>
+        <w:t>5.3  ESC PWM Output (BLDC Motor Control)</w:t>
+      </w:r>
+    </w:p>
+    <w:p>
+      <w:pPr>
+        <w:pStyle w:val="ListBullet"/>
+        <w:spacing w:before="20" w:after="20"/>
+        <w:ind w:left="360"/>
+      </w:pPr>
+      <w:r>
+        <w:rPr>
+          <w:sz w:val="22"/>
+        </w:rPr>
+        <w:t>Drives an ESC (Electronic Speed Controller) for a BLDC motor via a standard RC-style PWM signal on PA10 (TIM1_CH3).</w:t>
+      </w:r>
+    </w:p>
+    <w:p>
+      <w:pPr>
+        <w:pStyle w:val="ListBullet"/>
+        <w:spacing w:before="20" w:after="20"/>
+        <w:ind w:left="360"/>
+      </w:pPr>
+      <w:r>
+        <w:rPr>
+          <w:sz w:val="22"/>
+        </w:rPr>
+        <w:t>TIM1 configured for a 1 MHz counter (Prescaler=63) with a 20000-count period (Period/ARR=19999) → 20 ms period = 50 Hz, the standard RC/ESC signal rate.</w:t>
+      </w:r>
+    </w:p>
+    <w:p>
+      <w:pPr>
+        <w:pStyle w:val="ListBullet"/>
+        <w:spacing w:before="20" w:after="20"/>
+        <w:ind w:left="360"/>
+      </w:pPr>
+      <w:r>
+        <w:rPr>
+          <w:sz w:val="22"/>
+        </w:rPr>
+        <w:t>Because the counter runs at 1 MHz, the CCR (pulse) register value in counts equals the pulse width in microseconds directly — no extra scaling math needed.</w:t>
+      </w:r>
+    </w:p>
+    <w:p>
+      <w:pPr>
+        <w:pStyle w:val="ListBullet"/>
+        <w:spacing w:before="20" w:after="20"/>
+        <w:ind w:left="360"/>
+      </w:pPr>
+      <w:r>
+        <w:rPr>
+          <w:sz w:val="22"/>
+        </w:rPr>
+        <w:t>ThrottleTask maps the same 0–100 % throttle value used for THR: onto the pulse width: pwm_us = 1000 + (throttle × 1000 / 100), giving the standard 1000 µs (0 %) to 2000 µs (100 %) ESC convention.</w:t>
+      </w:r>
+    </w:p>
+    <w:p>
+      <w:pPr>
+        <w:pStyle w:val="ListBullet"/>
+        <w:spacing w:before="20" w:after="20"/>
+        <w:ind w:left="360"/>
+      </w:pPr>
+      <w:r>
+        <w:rPr>
+          <w:sz w:val="22"/>
+        </w:rPr>
+        <w:t>PWM output starts at boot (1000 µs, armed-and-idle) via HAL_TIM_PWM_Start(), before the RTOS scheduler takes over — the ESC sees a valid idle signal immediately rather than a floating pin.</w:t>
+      </w:r>
+    </w:p>
+    <w:p>
+      <w:pPr>
+        <w:pStyle w:val="ListBullet"/>
+        <w:spacing w:before="20" w:after="20"/>
+        <w:ind w:left="360"/>
+      </w:pPr>
+      <w:r>
+        <w:rPr>
+          <w:sz w:val="22"/>
+        </w:rPr>
+        <w:t>Firmware reports the mapped percentage every 200 ms:  PWM: 75   (mirrors THR: since the mapping is currently 1:1; reported separately so the GUI/log reflect the actual ESC command being sent, not just the RC input reading).</w:t>
+      </w:r>
+    </w:p>
+    <w:p>
+      <w:pPr>
+        <w:spacing w:before="200" w:after="40"/>
+      </w:pPr>
+      <w:r>
+        <w:rPr>
+          <w:b/>
+          <w:color w:val="007A87"/>
+          <w:sz w:val="26"/>
+        </w:rPr>
+        <w:t>5.4  FET Outputs</w:t>
       </w:r>
     </w:p>
     <w:p>
@@ -3195,7 +3380,7 @@
         <w:rPr>
           <w:sz w:val="22"/>
         </w:rPr>
-        <w:t>GUI FET panel layout — 2 rows × 4 columns:</w:t>
+        <w:t>GUI FET panel layout — 4 rows × 2 columns:</w:t>
       </w:r>
     </w:p>
     <w:p>
@@ -3208,7 +3393,7 @@
         <w:rPr>
           <w:sz w:val="22"/>
         </w:rPr>
-        <w:t>Row 0:  FET 1  |  FET 3  |  FET 5  |  ALL HIGH (green LED, sets all 6 HIGH)</w:t>
+        <w:t>Row 0: FET 1 | FET 2      Row 1: FET 3 | FET 4      Row 2: FET 5 | FET 6</w:t>
       </w:r>
     </w:p>
     <w:p>
@@ -3221,7 +3406,7 @@
         <w:rPr>
           <w:sz w:val="22"/>
         </w:rPr>
-        <w:t>Row 1:  FET 2  |  FET 4  |  FET 6  |  ALL LOW  (red LED,   sets all 6 LOW)</w:t>
+        <w:t>Row 3: ALL HIGH (green LED) | ALL LOW (red LED)</w:t>
       </w:r>
     </w:p>
     <w:p>
@@ -3260,7 +3445,7 @@
           <w:color w:val="007A87"/>
           <w:sz w:val="26"/>
         </w:rPr>
-        <w:t>5.4  Thermocouple Reading (TC1 + TC2)</w:t>
+        <w:t>5.5  Thermocouple Reading (TC1 + TC2)</w:t>
       </w:r>
     </w:p>
     <w:p>
@@ -3338,7 +3523,7 @@
           <w:color w:val="007A87"/>
           <w:sz w:val="26"/>
         </w:rPr>
-        <w:t>5.5  MCU Internal Temperature</w:t>
+        <w:t>5.6  MCU Internal Temperature</w:t>
       </w:r>
     </w:p>
     <w:p>
@@ -3403,7 +3588,7 @@
           <w:color w:val="007A87"/>
           <w:sz w:val="26"/>
         </w:rPr>
-        <w:t>5.6  PC Dashboard (Python GUI)</w:t>
+        <w:t>5.7  PC Dashboard (Python GUI)</w:t>
       </w:r>
     </w:p>
     <w:p>
@@ -3442,20 +3627,85 @@
         <w:rPr>
           <w:sz w:val="22"/>
         </w:rPr>
-        <w:t>Live gauges: THROTTLE, TACHOMETER (0–50 000 RPM placeholder) and BATTERY VOLTAGE (0–30 V) as 290 px needle dials, plus TC1 / TC2 / MCU vertical thermometer gauges.</w:t>
+        <w:t>Two-column layout — left: 2×2 gauge grid; right: stacked temperature / FET / log panel.</w:t>
       </w:r>
     </w:p>
     <w:p>
       <w:pPr>
         <w:pStyle w:val="ListBullet"/>
         <w:spacing w:before="20" w:after="20"/>
-        <w:ind w:left="360"/>
+        <w:ind w:left="720"/>
       </w:pPr>
       <w:r>
         <w:rPr>
           <w:sz w:val="22"/>
         </w:rPr>
-        <w:t>Each needle dial shows a digital value readout directly on the dial face, in the blank 90° wedge below the pivot where the sweep and tick labels leave genuinely empty space — avoids the value overlapping the needle at the center, and needs no separate box or border.</w:t>
+        <w:t>Left column, row 0: THROTTLE gauge  |  TACHOMETER gauge</w:t>
+      </w:r>
+    </w:p>
+    <w:p>
+      <w:pPr>
+        <w:pStyle w:val="ListBullet"/>
+        <w:spacing w:before="20" w:after="20"/>
+        <w:ind w:left="720"/>
+      </w:pPr>
+      <w:r>
+        <w:rPr>
+          <w:sz w:val="22"/>
+        </w:rPr>
+        <w:t>Left column, row 1: ESC PWM OUTPUT gauge  |  BATTERY VOLTAGE gauge</w:t>
+      </w:r>
+    </w:p>
+    <w:p>
+      <w:pPr>
+        <w:pStyle w:val="ListBullet"/>
+        <w:spacing w:before="20" w:after="20"/>
+        <w:ind w:left="720"/>
+      </w:pPr>
+      <w:r>
+        <w:rPr>
+          <w:sz w:val="22"/>
+        </w:rPr>
+        <w:t>All four are 290 px needle dials with a digital value readout on the dial face, in the blank 90° wedge below the pivot where the sweep and tick labels leave genuinely empty space — avoids the value overlapping the needle, and needs no separate box or border.</w:t>
+      </w:r>
+    </w:p>
+    <w:p>
+      <w:pPr>
+        <w:pStyle w:val="ListBullet"/>
+        <w:spacing w:before="20" w:after="20"/>
+        <w:ind w:left="360"/>
+      </w:pPr>
+      <w:r>
+        <w:rPr>
+          <w:sz w:val="22"/>
+        </w:rPr>
+        <w:t>Right column, top: TC1 / TC2 / MCU temperature graphs, each in its own bordered card, evenly justified across the column width (equal-weighted grid columns) so there is no empty gap.</w:t>
+      </w:r>
+    </w:p>
+    <w:p>
+      <w:pPr>
+        <w:pStyle w:val="ListBullet"/>
+        <w:spacing w:before="20" w:after="20"/>
+        <w:ind w:left="360"/>
+      </w:pPr>
+      <w:r>
+        <w:rPr>
+          <w:sz w:val="22"/>
+        </w:rPr>
+        <w:t>Right column, middle: FET panel, 4 rows × 2 columns (FET1/FET2, FET3/FET4, FET5/FET6, ALL HIGH/ALL LOW). Each cell: coloured LED, label, HIGH/LOW state text, action button on the right.</w:t>
+      </w:r>
+    </w:p>
+    <w:p>
+      <w:pPr>
+        <w:pStyle w:val="ListBullet"/>
+        <w:spacing w:before="20" w:after="20"/>
+        <w:ind w:left="360"/>
+      </w:pPr>
+      <w:r>
+        <w:rPr>
+          <w:sz w:val="22"/>
+        </w:rPr>
+        <w:t>Right column, bottom: serial log — confined to the right column's width (not the full window), height reduced to keep the overall window height close to the left gauge column's height.</w:t>
       </w:r>
     </w:p>
     <w:p>
@@ -3494,45 +3744,6 @@
         <w:rPr>
           <w:sz w:val="22"/>
         </w:rPr>
-        <w:t>FET panel: 2×4 grid (FET 1/3/5 + ALL HIGH in row 0 ; FET 2/4/6 + ALL LOW in row 1).</w:t>
-      </w:r>
-    </w:p>
-    <w:p>
-      <w:pPr>
-        <w:pStyle w:val="ListBullet"/>
-        <w:spacing w:before="20" w:after="20"/>
-        <w:ind w:left="360"/>
-      </w:pPr>
-      <w:r>
-        <w:rPr>
-          <w:sz w:val="22"/>
-        </w:rPr>
-        <w:t>Each FET cell: colour LED, label, HIGH/LOW state text, and action button on the right.</w:t>
-      </w:r>
-    </w:p>
-    <w:p>
-      <w:pPr>
-        <w:pStyle w:val="ListBullet"/>
-        <w:spacing w:before="20" w:after="20"/>
-        <w:ind w:left="360"/>
-      </w:pPr>
-      <w:r>
-        <w:rPr>
-          <w:sz w:val="22"/>
-        </w:rPr>
-        <w:t>ALL HIGH / ALL LOW styled identically to individual FET buttons for visual consistency.</w:t>
-      </w:r>
-    </w:p>
-    <w:p>
-      <w:pPr>
-        <w:pStyle w:val="ListBullet"/>
-        <w:spacing w:before="20" w:after="20"/>
-        <w:ind w:left="360"/>
-      </w:pPr>
-      <w:r>
-        <w:rPr>
-          <w:sz w:val="22"/>
-        </w:rPr>
         <w:t>RC calibration: SET RC button → step-by-step wizard (center position → full throw).</w:t>
       </w:r>
     </w:p>
@@ -3547,19 +3758,6 @@
           <w:sz w:val="22"/>
         </w:rPr>
         <w:t>RESET RC: clears RAM calibration; user must redo SET RC to restore custom mapping.</w:t>
-      </w:r>
-    </w:p>
-    <w:p>
-      <w:pPr>
-        <w:pStyle w:val="ListBullet"/>
-        <w:spacing w:before="20" w:after="20"/>
-        <w:ind w:left="360"/>
-      </w:pPr>
-      <w:r>
-        <w:rPr>
-          <w:sz w:val="22"/>
-        </w:rPr>
-        <w:t>Serial log panel with CLEAR button shows all raw UART output and sent commands.</w:t>
       </w:r>
     </w:p>
     <w:p>
@@ -3891,7 +4089,7 @@
               <w:rPr>
                 <w:sz w:val="20"/>
               </w:rPr>
-              <w:t>MCU: 24.4 C</w:t>
+              <w:t>PWM: 75</w:t>
             </w:r>
           </w:p>
         </w:tc>
@@ -3906,7 +4104,7 @@
               <w:rPr>
                 <w:sz w:val="20"/>
               </w:rPr>
-              <w:t>Every 1000 ms</w:t>
+              <w:t>Every 200 ms</w:t>
             </w:r>
           </w:p>
         </w:tc>
@@ -3914,6 +4112,53 @@
           <w:tcPr>
             <w:tcW w:type="dxa" w:w="4252"/>
             <w:shd w:val="clear" w:color="auto" w:fill="F2F2F2"/>
+            <w:vAlign w:val="center"/>
+          </w:tcPr>
+          <w:p>
+            <w:r>
+              <w:rPr>
+                <w:sz w:val="20"/>
+              </w:rPr>
+              <w:t>ESC PWM output percentage (mirrors THR — the actual mapped ESC command)</w:t>
+            </w:r>
+          </w:p>
+        </w:tc>
+      </w:tr>
+      <w:tr>
+        <w:tc>
+          <w:tcPr>
+            <w:tcW w:type="dxa" w:w="3402"/>
+            <w:shd w:val="clear" w:color="auto" w:fill="FFFFFF"/>
+            <w:vAlign w:val="center"/>
+          </w:tcPr>
+          <w:p>
+            <w:r>
+              <w:rPr>
+                <w:sz w:val="20"/>
+              </w:rPr>
+              <w:t>MCU: 24.4 C</w:t>
+            </w:r>
+          </w:p>
+        </w:tc>
+        <w:tc>
+          <w:tcPr>
+            <w:tcW w:type="dxa" w:w="1417"/>
+            <w:shd w:val="clear" w:color="auto" w:fill="FFFFFF"/>
+            <w:vAlign w:val="center"/>
+          </w:tcPr>
+          <w:p>
+            <w:r>
+              <w:rPr>
+                <w:sz w:val="20"/>
+              </w:rPr>
+              <w:t>Every ~1512 ms</w:t>
+            </w:r>
+          </w:p>
+        </w:tc>
+        <w:tc>
+          <w:tcPr>
+            <w:tcW w:type="dxa" w:w="4252"/>
+            <w:shd w:val="clear" w:color="auto" w:fill="FFFFFF"/>
             <w:vAlign w:val="center"/>
           </w:tcPr>
           <w:p>
@@ -3930,7 +4175,7 @@
         <w:tc>
           <w:tcPr>
             <w:tcW w:type="dxa" w:w="3402"/>
-            <w:shd w:val="clear" w:color="auto" w:fill="FFFFFF"/>
+            <w:shd w:val="clear" w:color="auto" w:fill="F2F2F2"/>
             <w:vAlign w:val="center"/>
           </w:tcPr>
           <w:p>
@@ -3945,7 +4190,7 @@
         <w:tc>
           <w:tcPr>
             <w:tcW w:type="dxa" w:w="1417"/>
-            <w:shd w:val="clear" w:color="auto" w:fill="FFFFFF"/>
+            <w:shd w:val="clear" w:color="auto" w:fill="F2F2F2"/>
             <w:vAlign w:val="center"/>
           </w:tcPr>
           <w:p>
@@ -3960,7 +4205,7 @@
         <w:tc>
           <w:tcPr>
             <w:tcW w:type="dxa" w:w="4252"/>
-            <w:shd w:val="clear" w:color="auto" w:fill="FFFFFF"/>
+            <w:shd w:val="clear" w:color="auto" w:fill="F2F2F2"/>
             <w:vAlign w:val="center"/>
           </w:tcPr>
           <w:p>
@@ -4430,7 +4675,7 @@
           <w:color w:val="777777"/>
           <w:sz w:val="22"/>
         </w:rPr>
-        <w:t>Board measurements (2026-07-01, direct-supply powered): 5.00 V → Raw 678, 10.00 V → Raw 1447, 20.00 V → Raw 2993, 24.00 V → Raw 3608. Anchored on the 5 V/24 V pair; the 10 V and 20 V points both validated within ±0.02 V of actual.</w:t>
+        <w:t>Board measurements (2026-07-02, direct-supply powered, re-checked): 5.00 V → Raw 770, 24.00 V → Raw 3710. Anchored on the widest available separation (5 V/24 V).</w:t>
       </w:r>
     </w:p>
     <w:p>
@@ -4443,7 +4688,85 @@
           <w:color w:val="007A87"/>
           <w:sz w:val="26"/>
         </w:rPr>
-        <w:t>7.2  RC Throttle Calibration  (optional — GUI-driven)</w:t>
+        <w:t>7.2  Grounding for Reliable UART Operation</w:t>
+      </w:r>
+    </w:p>
+    <w:p>
+      <w:pPr>
+        <w:spacing w:before="40" w:after="40"/>
+      </w:pPr>
+      <w:r>
+        <w:rPr>
+          <w:b w:val="0"/>
+          <w:i w:val="0"/>
+          <w:sz w:val="22"/>
+        </w:rPr>
+        <w:t>When the board is powered by the battery/supply instead of USB, the USB-TTL adapter's GND wire may be the only path tying the PC's ground and the board's ground together. Unplugging/replugging the TTL adapter in that condition can leave GND floating for a moment during the connector mating transition, which can glitch the UART RX line or briefly reset the MCU.</w:t>
+      </w:r>
+    </w:p>
+    <w:p>
+      <w:pPr>
+        <w:pStyle w:val="ListBullet"/>
+        <w:spacing w:before="20" w:after="20"/>
+        <w:ind w:left="360"/>
+      </w:pPr>
+      <w:r>
+        <w:rPr>
+          <w:sz w:val="22"/>
+        </w:rPr>
+        <w:t>Run a separate, permanently-connected ground wire from the battery's negative terminal directly to the Blue Pill's GND pin, independent of whichever wire is currently supplying power to the board.</w:t>
+      </w:r>
+    </w:p>
+    <w:p>
+      <w:pPr>
+        <w:pStyle w:val="ListBullet"/>
+        <w:spacing w:before="20" w:after="20"/>
+        <w:ind w:left="360"/>
+      </w:pPr>
+      <w:r>
+        <w:rPr>
+          <w:sz w:val="22"/>
+        </w:rPr>
+        <w:t>This ground wire should remain connected at all times, regardless of which power source (USB or battery) is active, or whether the USB-TTL adapter is plugged in.</w:t>
+      </w:r>
+    </w:p>
+    <w:p>
+      <w:pPr>
+        <w:pStyle w:val="ListBullet"/>
+        <w:spacing w:before="20" w:after="20"/>
+        <w:ind w:left="360"/>
+      </w:pPr>
+      <w:r>
+        <w:rPr>
+          <w:sz w:val="22"/>
+        </w:rPr>
+        <w:t>With a dedicated ground path in place, the TTL adapter's TX/RX/GND can be safely unplugged and replugged without disturbing the board's ground reference.</w:t>
+      </w:r>
+    </w:p>
+    <w:p>
+      <w:pPr>
+        <w:pStyle w:val="ListBullet"/>
+        <w:spacing w:before="20" w:after="20"/>
+        <w:ind w:left="360"/>
+      </w:pPr>
+      <w:r>
+        <w:rPr>
+          <w:sz w:val="22"/>
+        </w:rPr>
+        <w:t>This is the same underlying requirement as accurate battery voltage sensing (Section 5.1) — both the ADC divider and the UART need a ground reference that does not depend on which cable is currently plugged in.</w:t>
+      </w:r>
+    </w:p>
+    <w:p>
+      <w:pPr>
+        <w:spacing w:before="200" w:after="40"/>
+      </w:pPr>
+      <w:r>
+        <w:rPr>
+          <w:b/>
+          <w:color w:val="007A87"/>
+          <w:sz w:val="26"/>
+        </w:rPr>
+        <w:t>7.3  RC Throttle Calibration  (optional — GUI-driven)</w:t>
       </w:r>
     </w:p>
     <w:p>
@@ -4990,6 +5313,57 @@
     </w:p>
     <w:p>
       <w:pPr>
+        <w:spacing w:before="200" w:after="40"/>
+      </w:pPr>
+      <w:r>
+        <w:rPr>
+          <w:b/>
+          <w:color w:val="007A87"/>
+          <w:sz w:val="26"/>
+        </w:rPr>
+        <w:t>Issue: FET outputs turn HIGH then immediately revert to LOW on their own — happens on every individual FET and on FET_ALL:1 identically; no MCU reboot banner in the log</w:t>
+      </w:r>
+    </w:p>
+    <w:p>
+      <w:pPr>
+        <w:spacing w:before="40" w:after="20"/>
+      </w:pPr>
+      <w:r>
+        <w:rPr>
+          <w:b/>
+          <w:color w:val="D96500"/>
+          <w:sz w:val="22"/>
+        </w:rPr>
+        <w:t xml:space="preserve">Root Cause: </w:t>
+      </w:r>
+      <w:r>
+        <w:rPr>
+          <w:sz w:val="22"/>
+        </w:rPr>
+        <w:t>Firmware code was verified clean (no rogue GPIO write path resets the pins, individual and group commands share correct, identical logic, pin mapping between write and readback is consistent). Root-caused via staged testing: worked correctly on USB-TTL power alone, and on battery power with the TTL still connected — but failed specifically after unplugging and replugging the TTL adapter while the board ran on battery power. With no separate ground wire between the battery and the board, the TTL's GND wire was the only path tying the PC's ground and the board's ground together; unplugging it left GND floating momentarily, and the connector pins not mating simultaneously on replug caused a transient on RX/GND that glitched the UART or briefly reset the MCU (which re-runs the boot-time GPIO init that forces all FET pins LOW).</w:t>
+      </w:r>
+    </w:p>
+    <w:p>
+      <w:pPr>
+        <w:spacing w:before="20" w:after="120"/>
+      </w:pPr>
+      <w:r>
+        <w:rPr>
+          <w:b/>
+          <w:color w:val="1E7E34"/>
+          <w:sz w:val="22"/>
+        </w:rPr>
+        <w:t xml:space="preserve">Resolution: </w:t>
+      </w:r>
+      <w:r>
+        <w:rPr>
+          <w:sz w:val="22"/>
+        </w:rPr>
+        <w:t>Diagnosed root cause; recommended fix is a dedicated, permanently-connected ground wire from the battery's negative terminal directly to the Blue Pill's GND pin, independent of the USB-TTL cable — see Section 7.2. Same class of fix as the battery-voltage ground-reference issue above, applied to the UART connection instead of the ADC sense line. Pending field confirmation that the dedicated ground wire eliminates the issue.</w:t>
+      </w:r>
+    </w:p>
+    <w:p>
+      <w:pPr>
         <w:spacing w:before="280" w:after="80"/>
         <w:pBdr>
           <w:bottom w:val="single" w:sz="8" w:space="4" w:color="1A376C"/>
@@ -5053,6 +5427,19 @@
           <w:color w:val="1E7E34"/>
           <w:sz w:val="22"/>
         </w:rPr>
+        <w:t>✓  ESC PWM output — throttle % mapped 1:1 onto TIM1_CH3 (PA10), 1000–2000 µs @ 50 Hz, drives a BLDC ESC</w:t>
+      </w:r>
+    </w:p>
+    <w:p>
+      <w:pPr>
+        <w:pStyle w:val="ListBullet"/>
+        <w:spacing w:before="20" w:after="20"/>
+      </w:pPr>
+      <w:r>
+        <w:rPr>
+          <w:color w:val="1E7E34"/>
+          <w:sz w:val="22"/>
+        </w:rPr>
         <w:t>✓  Six FET outputs — individual toggle + ALL HIGH / ALL LOW group control</w:t>
       </w:r>
     </w:p>
@@ -5131,7 +5518,7 @@
           <w:color w:val="1E7E34"/>
           <w:sz w:val="22"/>
         </w:rPr>
-        <w:t>✓  PC Python GUI — live gauges with in-dial digital readout, Emergency Stop, USB-TTL disconnect detection, 2×4 FET panel, RC calibration wizard, serial log</w:t>
+        <w:t>✓  PC Python GUI — 2×2 left gauge grid (Throttle/Tach/PWM/Voltage), individually-boxed temp graphs, 4×2 FET panel, Emergency Stop, USB-TTL disconnect detection, RC calibration wizard, serial log</w:t>
       </w:r>
     </w:p>
     <w:p>
@@ -5205,6 +5592,26 @@
           <w:sz w:val="22"/>
         </w:rPr>
         <w:t>TC1/TC2 SPI reading is currently only in the original Arduino firmware. The CubeIDE firmware has SPI1/SPI2 configured but the MAX31855 read routine has not yet been ported to the STM32 HAL SPI API.</w:t>
+      </w:r>
+    </w:p>
+    <w:p>
+      <w:pPr>
+        <w:pStyle w:val="ListBullet"/>
+        <w:spacing w:before="40" w:after="40"/>
+      </w:pPr>
+      <w:r>
+        <w:rPr>
+          <w:b/>
+          <w:color w:val="D96500"/>
+          <w:sz w:val="22"/>
+        </w:rPr>
+        <w:t xml:space="preserve">○  FET outputs reverting to LOW on battery power — </w:t>
+      </w:r>
+      <w:r>
+        <w:rPr>
+          <w:sz w:val="22"/>
+        </w:rPr>
+        <w:t>Root cause diagnosed as a missing dedicated ground wire between the battery and the board (see Section 8 issue and Section 7.2). Fix identified but not yet confirmed in the field — verify the boot banner no longer reprints and FETs hold state after adding the ground wire.</w:t>
       </w:r>
     </w:p>
     <w:p>
@@ -5653,7 +6060,7 @@
               <w:rPr>
                 <w:sz w:val="20"/>
               </w:rPr>
-              <w:t>678 / 5000 mV</w:t>
+              <w:t>770 / 5000 mV</w:t>
             </w:r>
           </w:p>
         </w:tc>
@@ -5700,7 +6107,7 @@
               <w:rPr>
                 <w:sz w:val="20"/>
               </w:rPr>
-              <w:t>3608 / 24000 mV</w:t>
+              <w:t>3710 / 24000 mV</w:t>
             </w:r>
           </w:p>
         </w:tc>
@@ -5920,7 +6327,7 @@
               <w:rPr>
                 <w:sz w:val="20"/>
               </w:rPr>
-              <w:t>MCU clock</w:t>
+              <w:t>ESC PWM pulse range</w:t>
             </w:r>
           </w:p>
         </w:tc>
@@ -5935,6 +6342,147 @@
               <w:rPr>
                 <w:sz w:val="20"/>
               </w:rPr>
+              <w:t>1000–2000 µs</w:t>
+            </w:r>
+          </w:p>
+        </w:tc>
+        <w:tc>
+          <w:tcPr>
+            <w:tcW w:type="dxa" w:w="4535"/>
+            <w:shd w:val="clear" w:color="auto" w:fill="FFFFFF"/>
+            <w:vAlign w:val="center"/>
+          </w:tcPr>
+          <w:p>
+            <w:r>
+              <w:rPr>
+                <w:sz w:val="20"/>
+              </w:rPr>
+              <w:t>0–100 % throttle mapped 1:1 onto standard RC/ESC pulse convention</w:t>
+            </w:r>
+          </w:p>
+        </w:tc>
+      </w:tr>
+      <w:tr>
+        <w:tc>
+          <w:tcPr>
+            <w:tcW w:type="dxa" w:w="2551"/>
+            <w:shd w:val="clear" w:color="auto" w:fill="F2F2F2"/>
+            <w:vAlign w:val="center"/>
+          </w:tcPr>
+          <w:p>
+            <w:r>
+              <w:rPr>
+                <w:sz w:val="20"/>
+              </w:rPr>
+              <w:t>ESC PWM frequency</w:t>
+            </w:r>
+          </w:p>
+        </w:tc>
+        <w:tc>
+          <w:tcPr>
+            <w:tcW w:type="dxa" w:w="1984"/>
+            <w:shd w:val="clear" w:color="auto" w:fill="F2F2F2"/>
+            <w:vAlign w:val="center"/>
+          </w:tcPr>
+          <w:p>
+            <w:r>
+              <w:rPr>
+                <w:sz w:val="20"/>
+              </w:rPr>
+              <w:t>50 Hz (20 ms period)</w:t>
+            </w:r>
+          </w:p>
+        </w:tc>
+        <w:tc>
+          <w:tcPr>
+            <w:tcW w:type="dxa" w:w="4535"/>
+            <w:shd w:val="clear" w:color="auto" w:fill="F2F2F2"/>
+            <w:vAlign w:val="center"/>
+          </w:tcPr>
+          <w:p>
+            <w:r>
+              <w:rPr>
+                <w:sz w:val="20"/>
+              </w:rPr>
+              <w:t>TIM1: PSC=63 → 1 MHz counter, ARR=19999 → 20 ms period</w:t>
+            </w:r>
+          </w:p>
+        </w:tc>
+      </w:tr>
+      <w:tr>
+        <w:tc>
+          <w:tcPr>
+            <w:tcW w:type="dxa" w:w="2551"/>
+            <w:shd w:val="clear" w:color="auto" w:fill="FFFFFF"/>
+            <w:vAlign w:val="center"/>
+          </w:tcPr>
+          <w:p>
+            <w:r>
+              <w:rPr>
+                <w:sz w:val="20"/>
+              </w:rPr>
+              <w:t>ESC PWM idle-at-boot</w:t>
+            </w:r>
+          </w:p>
+        </w:tc>
+        <w:tc>
+          <w:tcPr>
+            <w:tcW w:type="dxa" w:w="1984"/>
+            <w:shd w:val="clear" w:color="auto" w:fill="FFFFFF"/>
+            <w:vAlign w:val="center"/>
+          </w:tcPr>
+          <w:p>
+            <w:r>
+              <w:rPr>
+                <w:sz w:val="20"/>
+              </w:rPr>
+              <w:t>1000 µs</w:t>
+            </w:r>
+          </w:p>
+        </w:tc>
+        <w:tc>
+          <w:tcPr>
+            <w:tcW w:type="dxa" w:w="4535"/>
+            <w:shd w:val="clear" w:color="auto" w:fill="FFFFFF"/>
+            <w:vAlign w:val="center"/>
+          </w:tcPr>
+          <w:p>
+            <w:r>
+              <w:rPr>
+                <w:sz w:val="20"/>
+              </w:rPr>
+              <w:t>Set before RTOS scheduler starts — ESC sees a valid signal immediately</w:t>
+            </w:r>
+          </w:p>
+        </w:tc>
+      </w:tr>
+      <w:tr>
+        <w:tc>
+          <w:tcPr>
+            <w:tcW w:type="dxa" w:w="2551"/>
+            <w:shd w:val="clear" w:color="auto" w:fill="F2F2F2"/>
+            <w:vAlign w:val="center"/>
+          </w:tcPr>
+          <w:p>
+            <w:r>
+              <w:rPr>
+                <w:sz w:val="20"/>
+              </w:rPr>
+              <w:t>MCU clock</w:t>
+            </w:r>
+          </w:p>
+        </w:tc>
+        <w:tc>
+          <w:tcPr>
+            <w:tcW w:type="dxa" w:w="1984"/>
+            <w:shd w:val="clear" w:color="auto" w:fill="F2F2F2"/>
+            <w:vAlign w:val="center"/>
+          </w:tcPr>
+          <w:p>
+            <w:r>
+              <w:rPr>
+                <w:sz w:val="20"/>
+              </w:rPr>
               <w:t>64 MHz</w:t>
             </w:r>
           </w:p>
@@ -5942,7 +6490,7 @@
         <w:tc>
           <w:tcPr>
             <w:tcW w:type="dxa" w:w="4535"/>
-            <w:shd w:val="clear" w:color="auto" w:fill="FFFFFF"/>
+            <w:shd w:val="clear" w:color="auto" w:fill="F2F2F2"/>
             <w:vAlign w:val="center"/>
           </w:tcPr>
           <w:p>
@@ -5959,7 +6507,7 @@
         <w:tc>
           <w:tcPr>
             <w:tcW w:type="dxa" w:w="2551"/>
-            <w:shd w:val="clear" w:color="auto" w:fill="F2F2F2"/>
+            <w:shd w:val="clear" w:color="auto" w:fill="FFFFFF"/>
             <w:vAlign w:val="center"/>
           </w:tcPr>
           <w:p>
@@ -5974,7 +6522,7 @@
         <w:tc>
           <w:tcPr>
             <w:tcW w:type="dxa" w:w="1984"/>
-            <w:shd w:val="clear" w:color="auto" w:fill="F2F2F2"/>
+            <w:shd w:val="clear" w:color="auto" w:fill="FFFFFF"/>
             <w:vAlign w:val="center"/>
           </w:tcPr>
           <w:p>
@@ -5989,7 +6537,7 @@
         <w:tc>
           <w:tcPr>
             <w:tcW w:type="dxa" w:w="4535"/>
-            <w:shd w:val="clear" w:color="auto" w:fill="F2F2F2"/>
+            <w:shd w:val="clear" w:color="auto" w:fill="FFFFFF"/>
             <w:vAlign w:val="center"/>
           </w:tcPr>
           <w:p>
@@ -6006,7 +6554,7 @@
         <w:tc>
           <w:tcPr>
             <w:tcW w:type="dxa" w:w="2551"/>
-            <w:shd w:val="clear" w:color="auto" w:fill="FFFFFF"/>
+            <w:shd w:val="clear" w:color="auto" w:fill="F2F2F2"/>
             <w:vAlign w:val="center"/>
           </w:tcPr>
           <w:p>
@@ -6021,7 +6569,7 @@
         <w:tc>
           <w:tcPr>
             <w:tcW w:type="dxa" w:w="1984"/>
-            <w:shd w:val="clear" w:color="auto" w:fill="FFFFFF"/>
+            <w:shd w:val="clear" w:color="auto" w:fill="F2F2F2"/>
             <w:vAlign w:val="center"/>
           </w:tcPr>
           <w:p>
@@ -6036,7 +6584,7 @@
         <w:tc>
           <w:tcPr>
             <w:tcW w:type="dxa" w:w="4535"/>
-            <w:shd w:val="clear" w:color="auto" w:fill="FFFFFF"/>
+            <w:shd w:val="clear" w:color="auto" w:fill="F2F2F2"/>
             <w:vAlign w:val="center"/>
           </w:tcPr>
           <w:p>
@@ -6053,7 +6601,7 @@
         <w:tc>
           <w:tcPr>
             <w:tcW w:type="dxa" w:w="2551"/>
-            <w:shd w:val="clear" w:color="auto" w:fill="F2F2F2"/>
+            <w:shd w:val="clear" w:color="auto" w:fill="FFFFFF"/>
             <w:vAlign w:val="center"/>
           </w:tcPr>
           <w:p>
@@ -6068,7 +6616,7 @@
         <w:tc>
           <w:tcPr>
             <w:tcW w:type="dxa" w:w="1984"/>
-            <w:shd w:val="clear" w:color="auto" w:fill="F2F2F2"/>
+            <w:shd w:val="clear" w:color="auto" w:fill="FFFFFF"/>
             <w:vAlign w:val="center"/>
           </w:tcPr>
           <w:p>
@@ -6083,7 +6631,7 @@
         <w:tc>
           <w:tcPr>
             <w:tcW w:type="dxa" w:w="4535"/>
-            <w:shd w:val="clear" w:color="auto" w:fill="F2F2F2"/>
+            <w:shd w:val="clear" w:color="auto" w:fill="FFFFFF"/>
             <w:vAlign w:val="center"/>
           </w:tcPr>
           <w:p>
@@ -6100,7 +6648,7 @@
         <w:tc>
           <w:tcPr>
             <w:tcW w:type="dxa" w:w="2551"/>
-            <w:shd w:val="clear" w:color="auto" w:fill="FFFFFF"/>
+            <w:shd w:val="clear" w:color="auto" w:fill="F2F2F2"/>
             <w:vAlign w:val="center"/>
           </w:tcPr>
           <w:p>
@@ -6115,7 +6663,7 @@
         <w:tc>
           <w:tcPr>
             <w:tcW w:type="dxa" w:w="1984"/>
-            <w:shd w:val="clear" w:color="auto" w:fill="FFFFFF"/>
+            <w:shd w:val="clear" w:color="auto" w:fill="F2F2F2"/>
             <w:vAlign w:val="center"/>
           </w:tcPr>
           <w:p>
@@ -6130,7 +6678,7 @@
         <w:tc>
           <w:tcPr>
             <w:tcW w:type="dxa" w:w="4535"/>
-            <w:shd w:val="clear" w:color="auto" w:fill="FFFFFF"/>
+            <w:shd w:val="clear" w:color="auto" w:fill="F2F2F2"/>
             <w:vAlign w:val="center"/>
           </w:tcPr>
           <w:p>
@@ -6147,7 +6695,7 @@
         <w:tc>
           <w:tcPr>
             <w:tcW w:type="dxa" w:w="2551"/>
-            <w:shd w:val="clear" w:color="auto" w:fill="F2F2F2"/>
+            <w:shd w:val="clear" w:color="auto" w:fill="FFFFFF"/>
             <w:vAlign w:val="center"/>
           </w:tcPr>
           <w:p>
@@ -6162,7 +6710,7 @@
         <w:tc>
           <w:tcPr>
             <w:tcW w:type="dxa" w:w="1984"/>
-            <w:shd w:val="clear" w:color="auto" w:fill="F2F2F2"/>
+            <w:shd w:val="clear" w:color="auto" w:fill="FFFFFF"/>
             <w:vAlign w:val="center"/>
           </w:tcPr>
           <w:p>
@@ -6177,7 +6725,7 @@
         <w:tc>
           <w:tcPr>
             <w:tcW w:type="dxa" w:w="4535"/>
-            <w:shd w:val="clear" w:color="auto" w:fill="F2F2F2"/>
+            <w:shd w:val="clear" w:color="auto" w:fill="FFFFFF"/>
             <w:vAlign w:val="center"/>
           </w:tcPr>
           <w:p>

</xml_diff>